<commit_message>
docs: atualiza documento de arquitetura v2.1.1
</commit_message>
<xml_diff>
--- a/docs/arq/arq_parnas.docx
+++ b/docs/arq/arq_parnas.docx
@@ -214,7 +214,15 @@
           <w:sz w:val="36"/>
           <w:szCs w:val="36"/>
         </w:rPr>
-        <w:t>Versão 2.0</w:t>
+        <w:t>Versão 2.</w:t>
+      </w:r>
+      <w:r>
+        <w:rPr>
+          <w:rFonts w:cs="Times New Roman"/>
+          <w:sz w:val="36"/>
+          <w:szCs w:val="36"/>
+        </w:rPr>
+        <w:t>1</w:t>
       </w:r>
       <w:r>
         <w:rPr>
@@ -1855,8 +1863,8 @@
       <w:tblGrid>
         <w:gridCol w:w="1350"/>
         <w:gridCol w:w="930"/>
-        <w:gridCol w:w="3846"/>
-        <w:gridCol w:w="2910"/>
+        <w:gridCol w:w="4425"/>
+        <w:gridCol w:w="2331"/>
       </w:tblGrid>
       <w:tr>
         <w:tc>
@@ -1939,7 +1947,7 @@
         </w:tc>
         <w:tc>
           <w:tcPr>
-            <w:tcW w:w="3846" w:type="dxa"/>
+            <w:tcW w:w="4425" w:type="dxa"/>
             <w:tcBorders>
               <w:top w:val="single" w:color="000000" w:themeColor="text1" w:sz="2" w:space="0"/>
               <w:left w:val="single" w:color="000000" w:themeColor="text1" w:sz="2" w:space="0"/>
@@ -1978,7 +1986,7 @@
         </w:tc>
         <w:tc>
           <w:tcPr>
-            <w:tcW w:w="2910" w:type="dxa"/>
+            <w:tcW w:w="2331" w:type="dxa"/>
             <w:tcBorders>
               <w:top w:val="single" w:color="000000" w:themeColor="text1" w:sz="2" w:space="0"/>
               <w:left w:val="single" w:color="000000" w:themeColor="text1" w:sz="2" w:space="0"/>
@@ -2098,7 +2106,7 @@
         </w:tc>
         <w:tc>
           <w:tcPr>
-            <w:tcW w:w="3846" w:type="dxa"/>
+            <w:tcW w:w="4425" w:type="dxa"/>
             <w:tcBorders>
               <w:left w:val="single" w:color="000000" w:themeColor="text1" w:sz="2" w:space="0"/>
               <w:bottom w:val="single" w:color="000000" w:themeColor="text1" w:sz="2" w:space="0"/>
@@ -2132,7 +2140,7 @@
         </w:tc>
         <w:tc>
           <w:tcPr>
-            <w:tcW w:w="2910" w:type="dxa"/>
+            <w:tcW w:w="2331" w:type="dxa"/>
             <w:tcBorders>
               <w:left w:val="single" w:color="000000" w:themeColor="text1" w:sz="2" w:space="0"/>
               <w:bottom w:val="single" w:color="000000" w:themeColor="text1" w:sz="2" w:space="0"/>
@@ -2266,7 +2274,7 @@
         </w:tc>
         <w:tc>
           <w:tcPr>
-            <w:tcW w:w="3846" w:type="dxa"/>
+            <w:tcW w:w="4425" w:type="dxa"/>
             <w:tcBorders>
               <w:left w:val="single" w:color="000000" w:themeColor="text1" w:sz="2" w:space="0"/>
               <w:bottom w:val="single" w:color="000000" w:themeColor="text1" w:sz="2" w:space="0"/>
@@ -2370,7 +2378,7 @@
         </w:tc>
         <w:tc>
           <w:tcPr>
-            <w:tcW w:w="2910" w:type="dxa"/>
+            <w:tcW w:w="2331" w:type="dxa"/>
             <w:tcBorders>
               <w:left w:val="single" w:color="000000" w:themeColor="text1" w:sz="2" w:space="0"/>
               <w:bottom w:val="single" w:color="000000" w:themeColor="text1" w:sz="2" w:space="0"/>
@@ -2424,6 +2432,8 @@
               <w:jc w:val="both"/>
               <w:rPr>
                 <w:rFonts w:ascii="Times New Roman" w:hAnsi="Times New Roman" w:eastAsia="Times New Roman" w:cs="Times New Roman"/>
+                <w:b w:val="1"/>
+                <w:bCs w:val="1"/>
                 <w:color w:val="auto"/>
                 <w:sz w:val="24"/>
                 <w:szCs w:val="24"/>
@@ -2433,12 +2443,26 @@
             <w:r>
               <w:rPr>
                 <w:rFonts w:ascii="Times New Roman" w:hAnsi="Times New Roman" w:eastAsia="Times New Roman" w:cs="Times New Roman"/>
+                <w:b w:val="1"/>
+                <w:bCs w:val="1"/>
                 <w:color w:val="auto"/>
                 <w:sz w:val="24"/>
                 <w:szCs w:val="24"/>
                 <w:lang w:val="pt-BR"/>
               </w:rPr>
-              <w:t>03/06/2026</w:t>
+              <w:t>03/06/</w:t>
+            </w:r>
+            <w:r>
+              <w:rPr>
+                <w:rFonts w:ascii="Times New Roman" w:hAnsi="Times New Roman" w:eastAsia="Times New Roman" w:cs="Times New Roman"/>
+                <w:b w:val="1"/>
+                <w:bCs w:val="1"/>
+                <w:color w:val="auto"/>
+                <w:sz w:val="24"/>
+                <w:szCs w:val="24"/>
+                <w:lang w:val="pt-BR"/>
+              </w:rPr>
+              <w:t>2026</w:t>
             </w:r>
           </w:p>
         </w:tc>
@@ -2478,7 +2502,7 @@
         </w:tc>
         <w:tc>
           <w:tcPr>
-            <w:tcW w:w="3846" w:type="dxa"/>
+            <w:tcW w:w="4425" w:type="dxa"/>
             <w:tcBorders>
               <w:left w:val="single" w:color="000000" w:themeColor="text1" w:sz="2" w:space="0"/>
               <w:bottom w:val="single" w:color="000000" w:themeColor="text1" w:sz="2" w:space="0"/>
@@ -2522,7 +2546,7 @@
         </w:tc>
         <w:tc>
           <w:tcPr>
-            <w:tcW w:w="2910" w:type="dxa"/>
+            <w:tcW w:w="2331" w:type="dxa"/>
             <w:tcBorders>
               <w:left w:val="single" w:color="000000" w:themeColor="text1" w:sz="2" w:space="0"/>
               <w:bottom w:val="single" w:color="000000" w:themeColor="text1" w:sz="2" w:space="0"/>
@@ -2573,12 +2597,26 @@
               <w:jc w:val="both"/>
               <w:rPr>
                 <w:rFonts w:ascii="Times New Roman" w:hAnsi="Times New Roman" w:cs="Times New Roman"/>
-                <w:color w:val="0432FF"/>
+                <w:b w:val="1"/>
+                <w:bCs w:val="1"/>
+                <w:color w:val="auto"/>
                 <w:sz w:val="24"/>
                 <w:szCs w:val="24"/>
                 <w:lang w:val="pt-BR"/>
               </w:rPr>
             </w:pPr>
+            <w:r>
+              <w:rPr>
+                <w:rFonts w:ascii="Times New Roman" w:hAnsi="Times New Roman" w:cs="Times New Roman"/>
+                <w:b w:val="1"/>
+                <w:bCs w:val="1"/>
+                <w:color w:val="auto"/>
+                <w:sz w:val="24"/>
+                <w:szCs w:val="24"/>
+                <w:lang w:val="pt-BR"/>
+              </w:rPr>
+              <w:t>05/06/2026</w:t>
+            </w:r>
           </w:p>
         </w:tc>
         <w:tc>
@@ -2597,17 +2635,27 @@
               <w:jc w:val="both"/>
               <w:rPr>
                 <w:rFonts w:ascii="Times New Roman" w:hAnsi="Times New Roman" w:cs="Times New Roman"/>
-                <w:color w:val="0432FF"/>
+                <w:color w:val="auto"/>
                 <w:sz w:val="24"/>
                 <w:szCs w:val="24"/>
                 <w:lang w:val="pt-BR"/>
               </w:rPr>
             </w:pPr>
+            <w:r>
+              <w:rPr>
+                <w:rFonts w:ascii="Times New Roman" w:hAnsi="Times New Roman" w:cs="Times New Roman"/>
+                <w:color w:val="auto"/>
+                <w:sz w:val="24"/>
+                <w:szCs w:val="24"/>
+                <w:lang w:val="pt-BR"/>
+              </w:rPr>
+              <w:t>2.1.1</w:t>
+            </w:r>
           </w:p>
         </w:tc>
         <w:tc>
           <w:tcPr>
-            <w:tcW w:w="3846" w:type="dxa"/>
+            <w:tcW w:w="4425" w:type="dxa"/>
             <w:tcBorders>
               <w:left w:val="single" w:color="000000" w:themeColor="text1" w:sz="2" w:space="0"/>
               <w:bottom w:val="single" w:color="000000" w:themeColor="text1" w:sz="2" w:space="0"/>
@@ -2621,17 +2669,27 @@
               <w:jc w:val="both"/>
               <w:rPr>
                 <w:rFonts w:ascii="Times New Roman" w:hAnsi="Times New Roman" w:cs="Times New Roman"/>
-                <w:color w:val="0432FF"/>
+                <w:color w:val="auto"/>
                 <w:sz w:val="24"/>
                 <w:szCs w:val="24"/>
-                <w:lang w:val="pt-BR"/>
+                <w:lang w:val="es-ES"/>
               </w:rPr>
             </w:pPr>
+            <w:r>
+              <w:rPr>
+                <w:rFonts w:ascii="Times New Roman" w:hAnsi="Times New Roman" w:cs="Times New Roman"/>
+                <w:color w:val="auto"/>
+                <w:sz w:val="24"/>
+                <w:szCs w:val="24"/>
+                <w:lang w:val="es-ES"/>
+              </w:rPr>
+              <w:t>Alinhamento da implementação</w:t>
+            </w:r>
           </w:p>
         </w:tc>
         <w:tc>
           <w:tcPr>
-            <w:tcW w:w="2910" w:type="dxa"/>
+            <w:tcW w:w="2331" w:type="dxa"/>
             <w:tcBorders>
               <w:left w:val="single" w:color="000000" w:themeColor="text1" w:sz="2" w:space="0"/>
               <w:bottom w:val="single" w:color="000000" w:themeColor="text1" w:sz="2" w:space="0"/>
@@ -2646,12 +2704,22 @@
               <w:jc w:val="both"/>
               <w:rPr>
                 <w:rFonts w:ascii="Times New Roman" w:hAnsi="Times New Roman" w:cs="Times New Roman"/>
-                <w:color w:val="0432FF"/>
+                <w:color w:val="auto"/>
                 <w:sz w:val="24"/>
                 <w:szCs w:val="24"/>
                 <w:lang w:val="pt-BR"/>
               </w:rPr>
             </w:pPr>
+            <w:r>
+              <w:rPr>
+                <w:rFonts w:ascii="Times New Roman" w:hAnsi="Times New Roman" w:cs="Times New Roman"/>
+                <w:color w:val="auto"/>
+                <w:sz w:val="24"/>
+                <w:szCs w:val="24"/>
+                <w:lang w:val="pt-BR"/>
+              </w:rPr>
+              <w:t>Carlos Costa</w:t>
+            </w:r>
           </w:p>
         </w:tc>
       </w:tr>
@@ -3903,79 +3971,124 @@
       </w:pPr>
       <w:r>
         <w:rPr/>
-        <w:t xml:space="preserve">O sistema KeepUnB seguirá um modelo de arquitetura híbrido, combinando diferentes estilos arquiteturais para atender às necessidades específicas do </w:t>
+        <w:t xml:space="preserve">No </w:t>
+      </w:r>
+      <w:r>
+        <w:rPr>
+          <w:i w:val="1"/>
+          <w:iCs w:val="1"/>
+        </w:rPr>
+        <w:t>backend</w:t>
       </w:r>
       <w:r>
         <w:rPr/>
-        <w:t>backend</w:t>
+        <w:t>, será adotada uma Arquitetura em Camadas (</w:t>
+      </w:r>
+      <w:r>
+        <w:rPr>
+          <w:i w:val="1"/>
+          <w:iCs w:val="1"/>
+        </w:rPr>
+        <w:t>Layered Architecture</w:t>
       </w:r>
       <w:r>
         <w:rPr/>
-        <w:t xml:space="preserve"> e do </w:t>
+        <w:t xml:space="preserve">) baseada no padrão </w:t>
+      </w:r>
+      <w:r>
+        <w:rPr>
+          <w:i w:val="1"/>
+          <w:iCs w:val="1"/>
+        </w:rPr>
+        <w:t>Service-Repository</w:t>
       </w:r>
       <w:r>
         <w:rPr/>
-        <w:t>frontend</w:t>
+        <w:t xml:space="preserve">, em conjunto com o </w:t>
+      </w:r>
+      <w:r>
+        <w:rPr>
+          <w:i w:val="1"/>
+          <w:iCs w:val="1"/>
+        </w:rPr>
+        <w:t xml:space="preserve">framework </w:t>
+      </w:r>
+      <w:r>
+        <w:rPr>
+          <w:i w:val="0"/>
+          <w:iCs w:val="0"/>
+        </w:rPr>
+        <w:t>FastAPI</w:t>
       </w:r>
       <w:r>
         <w:rPr/>
-        <w:t xml:space="preserve"> (WASHIZAKI, 2024)</w:t>
+        <w:t xml:space="preserve">. Essa arquitetura organiza o sistema em camadas de responsabilidade bem delimitadas, sendo elas: </w:t>
+      </w:r>
+      <w:r>
+        <w:rPr>
+          <w:i w:val="1"/>
+          <w:iCs w:val="1"/>
+        </w:rPr>
+        <w:t xml:space="preserve">Routers </w:t>
       </w:r>
       <w:r>
         <w:rPr/>
-        <w:t xml:space="preserve">. </w:t>
+        <w:t xml:space="preserve">(pontos de entrada/rotas HTTP), </w:t>
+      </w:r>
+      <w:r>
+        <w:rPr>
+          <w:i w:val="1"/>
+          <w:iCs w:val="1"/>
+        </w:rPr>
+        <w:t xml:space="preserve">Services </w:t>
       </w:r>
       <w:r>
         <w:rPr/>
-        <w:t xml:space="preserve">No </w:t>
+        <w:t xml:space="preserve">(lógica de negócio), </w:t>
+      </w:r>
+      <w:r>
+        <w:rPr>
+          <w:i w:val="1"/>
+          <w:iCs w:val="1"/>
+        </w:rPr>
+        <w:t xml:space="preserve">Repositories </w:t>
       </w:r>
       <w:r>
         <w:rPr/>
-        <w:t>backend</w:t>
+        <w:t xml:space="preserve">(acesso a dados), </w:t>
+      </w:r>
+      <w:r>
+        <w:rPr>
+          <w:i w:val="1"/>
+          <w:iCs w:val="1"/>
+        </w:rPr>
+        <w:t xml:space="preserve">Models </w:t>
       </w:r>
       <w:r>
         <w:rPr/>
-        <w:t>, será adotada a arquitetura MVC (Model-</w:t>
+        <w:t xml:space="preserve">(entidades ORM do banco de dados) e </w:t>
+      </w:r>
+      <w:r>
+        <w:rPr>
+          <w:i w:val="1"/>
+          <w:iCs w:val="1"/>
+        </w:rPr>
+        <w:t xml:space="preserve">Schemas </w:t>
       </w:r>
       <w:r>
         <w:rPr/>
-        <w:t>View</w:t>
+        <w:t xml:space="preserve">(validação e serialização de dados via </w:t>
+      </w:r>
+      <w:r>
+        <w:rPr>
+          <w:i w:val="1"/>
+          <w:iCs w:val="1"/>
+        </w:rPr>
+        <w:t>Pydantic</w:t>
       </w:r>
       <w:r>
         <w:rPr/>
-        <w:t>-</w:t>
-      </w:r>
-      <w:r>
-        <w:rPr/>
-        <w:t>Controller</w:t>
-      </w:r>
-      <w:r>
-        <w:rPr/>
-        <w:t xml:space="preserve">) em conjunto com o framework </w:t>
-      </w:r>
-      <w:r>
-        <w:rPr/>
-        <w:t>FastAPI</w:t>
-      </w:r>
-      <w:r>
-        <w:rPr/>
-        <w:t xml:space="preserve">. Essa arquitetura organiza o sistema em três camadas, onde o Model representa os dados e entidades, o </w:t>
-      </w:r>
-      <w:r>
-        <w:rPr/>
-        <w:t>Controller</w:t>
-      </w:r>
-      <w:r>
-        <w:rPr/>
-        <w:t xml:space="preserve"> concentra as regras de negócio e o </w:t>
-      </w:r>
-      <w:r>
-        <w:rPr/>
-        <w:t>View</w:t>
-      </w:r>
-      <w:r>
-        <w:rPr/>
-        <w:t xml:space="preserve"> define os contratos de entrada e saída da API.</w:t>
+        <w:t>).</w:t>
       </w:r>
     </w:p>
     <w:p>
@@ -4199,6 +4312,8 @@
       <w:r>
         <w:rPr>
           <w:rFonts w:ascii="Times New Roman" w:hAnsi="Times New Roman" w:eastAsia="Times New Roman" w:cs="Times New Roman"/>
+          <w:i w:val="1"/>
+          <w:iCs w:val="1"/>
           <w:noProof w:val="0"/>
           <w:sz w:val="24"/>
           <w:szCs w:val="24"/>
@@ -4214,27 +4329,31 @@
           <w:szCs w:val="24"/>
           <w:lang w:val="pt-BR"/>
         </w:rPr>
-        <w:t>, a adoção do padrão MVC permite organizar o código de forma clara e familiar para a equipe, separando responsabilidades entre dados (Model), lógica de negócio (</w:t>
-      </w:r>
-      <w:r>
-        <w:rPr>
-          <w:rFonts w:ascii="Times New Roman" w:hAnsi="Times New Roman" w:eastAsia="Times New Roman" w:cs="Times New Roman"/>
+        <w:t>, a adoção do padrão</w:t>
+      </w:r>
+      <w:r>
+        <w:rPr>
+          <w:rFonts w:ascii="Times New Roman" w:hAnsi="Times New Roman" w:eastAsia="Times New Roman" w:cs="Times New Roman"/>
+          <w:i w:val="1"/>
+          <w:iCs w:val="1"/>
           <w:noProof w:val="0"/>
           <w:sz w:val="24"/>
           <w:szCs w:val="24"/>
           <w:lang w:val="pt-BR"/>
         </w:rPr>
-        <w:t>Controller</w:t>
-      </w:r>
-      <w:r>
-        <w:rPr>
-          <w:rFonts w:ascii="Times New Roman" w:hAnsi="Times New Roman" w:eastAsia="Times New Roman" w:cs="Times New Roman"/>
+        <w:t xml:space="preserve"> Service-</w:t>
+      </w:r>
+      <w:r>
+        <w:rPr>
+          <w:rFonts w:ascii="Times New Roman" w:hAnsi="Times New Roman" w:eastAsia="Times New Roman" w:cs="Times New Roman"/>
+          <w:i w:val="1"/>
+          <w:iCs w:val="1"/>
           <w:noProof w:val="0"/>
           <w:sz w:val="24"/>
           <w:szCs w:val="24"/>
           <w:lang w:val="pt-BR"/>
         </w:rPr>
-        <w:t>) e serialização de respostas (</w:t>
+        <w:t>Repository</w:t>
       </w:r>
       <w:r>
         <w:rPr>
@@ -4244,17 +4363,161 @@
           <w:szCs w:val="24"/>
           <w:lang w:val="pt-BR"/>
         </w:rPr>
-        <w:t>View</w:t>
-      </w:r>
-      <w:r>
-        <w:rPr>
-          <w:rFonts w:ascii="Times New Roman" w:hAnsi="Times New Roman" w:eastAsia="Times New Roman" w:cs="Times New Roman"/>
+        <w:t xml:space="preserve"> permite organizar o código de forma clara e familiar para a equipe, separando as responsabilidades de acesso a dados </w:t>
+      </w:r>
+      <w:r>
+        <w:rPr>
+          <w:rFonts w:ascii="Times New Roman" w:hAnsi="Times New Roman" w:eastAsia="Times New Roman" w:cs="Times New Roman"/>
+          <w:i w:val="1"/>
+          <w:iCs w:val="1"/>
           <w:noProof w:val="0"/>
           <w:sz w:val="24"/>
           <w:szCs w:val="24"/>
           <w:lang w:val="pt-BR"/>
         </w:rPr>
-        <w:t xml:space="preserve">). </w:t>
+        <w:t>(</w:t>
+      </w:r>
+      <w:r>
+        <w:rPr>
+          <w:rFonts w:ascii="Times New Roman" w:hAnsi="Times New Roman" w:eastAsia="Times New Roman" w:cs="Times New Roman"/>
+          <w:i w:val="1"/>
+          <w:iCs w:val="1"/>
+          <w:noProof w:val="0"/>
+          <w:sz w:val="24"/>
+          <w:szCs w:val="24"/>
+          <w:lang w:val="pt-BR"/>
+        </w:rPr>
+        <w:t>Repositories</w:t>
+      </w:r>
+      <w:r>
+        <w:rPr>
+          <w:rFonts w:ascii="Times New Roman" w:hAnsi="Times New Roman" w:eastAsia="Times New Roman" w:cs="Times New Roman"/>
+          <w:i w:val="1"/>
+          <w:iCs w:val="1"/>
+          <w:noProof w:val="0"/>
+          <w:sz w:val="24"/>
+          <w:szCs w:val="24"/>
+          <w:lang w:val="pt-BR"/>
+        </w:rPr>
+        <w:t>)</w:t>
+      </w:r>
+      <w:r>
+        <w:rPr>
+          <w:rFonts w:ascii="Times New Roman" w:hAnsi="Times New Roman" w:eastAsia="Times New Roman" w:cs="Times New Roman"/>
+          <w:noProof w:val="0"/>
+          <w:sz w:val="24"/>
+          <w:szCs w:val="24"/>
+          <w:lang w:val="pt-BR"/>
+        </w:rPr>
+        <w:t xml:space="preserve">, regras corporativas </w:t>
+      </w:r>
+      <w:r>
+        <w:rPr>
+          <w:rFonts w:ascii="Times New Roman" w:hAnsi="Times New Roman" w:eastAsia="Times New Roman" w:cs="Times New Roman"/>
+          <w:i w:val="1"/>
+          <w:iCs w:val="1"/>
+          <w:noProof w:val="0"/>
+          <w:sz w:val="24"/>
+          <w:szCs w:val="24"/>
+          <w:lang w:val="pt-BR"/>
+        </w:rPr>
+        <w:t>(Services)</w:t>
+      </w:r>
+      <w:r>
+        <w:rPr>
+          <w:rFonts w:ascii="Times New Roman" w:hAnsi="Times New Roman" w:eastAsia="Times New Roman" w:cs="Times New Roman"/>
+          <w:noProof w:val="0"/>
+          <w:sz w:val="24"/>
+          <w:szCs w:val="24"/>
+          <w:lang w:val="pt-BR"/>
+        </w:rPr>
+        <w:t xml:space="preserve">, validação de </w:t>
+      </w:r>
+      <w:r>
+        <w:rPr>
+          <w:rFonts w:ascii="Times New Roman" w:hAnsi="Times New Roman" w:eastAsia="Times New Roman" w:cs="Times New Roman"/>
+          <w:noProof w:val="0"/>
+          <w:sz w:val="24"/>
+          <w:szCs w:val="24"/>
+          <w:lang w:val="pt-BR"/>
+        </w:rPr>
+        <w:t>payload</w:t>
+      </w:r>
+      <w:r>
+        <w:rPr>
+          <w:rFonts w:ascii="Times New Roman" w:hAnsi="Times New Roman" w:eastAsia="Times New Roman" w:cs="Times New Roman"/>
+          <w:noProof w:val="0"/>
+          <w:sz w:val="24"/>
+          <w:szCs w:val="24"/>
+          <w:lang w:val="pt-BR"/>
+        </w:rPr>
+        <w:t xml:space="preserve"> </w:t>
+      </w:r>
+      <w:r>
+        <w:rPr>
+          <w:rFonts w:ascii="Times New Roman" w:hAnsi="Times New Roman" w:eastAsia="Times New Roman" w:cs="Times New Roman"/>
+          <w:i w:val="1"/>
+          <w:iCs w:val="1"/>
+          <w:noProof w:val="0"/>
+          <w:sz w:val="24"/>
+          <w:szCs w:val="24"/>
+          <w:lang w:val="pt-BR"/>
+        </w:rPr>
+        <w:t>(</w:t>
+      </w:r>
+      <w:r>
+        <w:rPr>
+          <w:rFonts w:ascii="Times New Roman" w:hAnsi="Times New Roman" w:eastAsia="Times New Roman" w:cs="Times New Roman"/>
+          <w:i w:val="1"/>
+          <w:iCs w:val="1"/>
+          <w:noProof w:val="0"/>
+          <w:sz w:val="24"/>
+          <w:szCs w:val="24"/>
+          <w:lang w:val="pt-BR"/>
+        </w:rPr>
+        <w:t>Schemas</w:t>
+      </w:r>
+      <w:r>
+        <w:rPr>
+          <w:rFonts w:ascii="Times New Roman" w:hAnsi="Times New Roman" w:eastAsia="Times New Roman" w:cs="Times New Roman"/>
+          <w:i w:val="1"/>
+          <w:iCs w:val="1"/>
+          <w:noProof w:val="0"/>
+          <w:sz w:val="24"/>
+          <w:szCs w:val="24"/>
+          <w:lang w:val="pt-BR"/>
+        </w:rPr>
+        <w:t>)</w:t>
+      </w:r>
+      <w:r>
+        <w:rPr>
+          <w:rFonts w:ascii="Times New Roman" w:hAnsi="Times New Roman" w:eastAsia="Times New Roman" w:cs="Times New Roman"/>
+          <w:noProof w:val="0"/>
+          <w:sz w:val="24"/>
+          <w:szCs w:val="24"/>
+          <w:lang w:val="pt-BR"/>
+        </w:rPr>
+        <w:t xml:space="preserve"> e rotas HTTP (</w:t>
+      </w:r>
+      <w:r>
+        <w:rPr>
+          <w:rFonts w:ascii="Times New Roman" w:hAnsi="Times New Roman" w:eastAsia="Times New Roman" w:cs="Times New Roman"/>
+          <w:noProof w:val="0"/>
+          <w:sz w:val="24"/>
+          <w:szCs w:val="24"/>
+          <w:lang w:val="pt-BR"/>
+        </w:rPr>
+        <w:t>Routers</w:t>
+      </w:r>
+      <w:r>
+        <w:rPr>
+          <w:rFonts w:ascii="Times New Roman" w:hAnsi="Times New Roman" w:eastAsia="Times New Roman" w:cs="Times New Roman"/>
+          <w:noProof w:val="0"/>
+          <w:sz w:val="24"/>
+          <w:szCs w:val="24"/>
+          <w:lang w:val="pt-BR"/>
+        </w:rPr>
+        <w:t>).</w:t>
       </w:r>
       <w:r>
         <w:rPr>
@@ -4269,6 +4532,9 @@
       <w:r>
         <w:rPr/>
         <w:t>Isso facilita o desenvolvimento incremental, a manutenção e a realização de testes automatizados, contribuindo para atingir a meta de qualidade definida no projeto, que prevê cobertura mínima de 80% de testes automatizados para novas funcionalidades (BECK; ANDRES, 2004).</w:t>
+      </w:r>
+      <w:r>
+        <w:tab/>
       </w:r>
     </w:p>
     <w:p>
@@ -4308,7 +4574,17 @@
           <w:szCs w:val="24"/>
           <w:lang w:val="pt-BR"/>
         </w:rPr>
-        <w:t>Portanto, a combinação entre MVC no backend e Feature-based Architecture no frontend atende às necessidades do KeepUnB, pois favorece testes, organização, manutenção, desenvolvimento incremental e separação clara de responsabilidades.</w:t>
+        <w:t>Portanto, a combinação entre a Arquitetura em Camadas (Service-Repository) no backend e Feature-based Architecture no frontend atende às necessidades do KeepUnB</w:t>
+      </w:r>
+      <w:r>
+        <w:rPr>
+          <w:rFonts w:ascii="Times New Roman" w:hAnsi="Times New Roman" w:eastAsia="Times New Roman" w:cs="Times New Roman"/>
+          <w:noProof w:val="0"/>
+          <w:sz w:val="24"/>
+          <w:szCs w:val="24"/>
+          <w:lang w:val="pt-BR"/>
+        </w:rPr>
+        <w:t>, pois favorece testes, organização, manutenção, desenvolvimento incremental e separação clara de responsabilidades.</w:t>
       </w:r>
     </w:p>
     <w:p>
@@ -4410,13 +4686,23 @@
       <w:r>
         <w:rPr>
           <w:rFonts w:ascii="Times New Roman" w:hAnsi="Times New Roman" w:eastAsia="Times New Roman" w:cs="Times New Roman"/>
-          <w:sz w:val="24"/>
-          <w:szCs w:val="24"/>
-        </w:rPr>
-        <w:t>Backend, desenvolvido com FastAPI/Python seguindo o padrão MVC.</w:t>
-      </w:r>
-    </w:p>
-    <w:p w14:noSpellErr="1">
+          <w:i w:val="1"/>
+          <w:iCs w:val="1"/>
+          <w:sz w:val="24"/>
+          <w:szCs w:val="24"/>
+        </w:rPr>
+        <w:t>Backend</w:t>
+      </w:r>
+      <w:r>
+        <w:rPr>
+          <w:rFonts w:ascii="Times New Roman" w:hAnsi="Times New Roman" w:eastAsia="Times New Roman" w:cs="Times New Roman"/>
+          <w:sz w:val="24"/>
+          <w:szCs w:val="24"/>
+        </w:rPr>
+        <w:t>, desenvolvido com FastAPI/Python seguindo o padrão Service-Repository.</w:t>
+      </w:r>
+    </w:p>
+    <w:p>
       <w:pPr>
         <w:spacing w:before="120"/>
         <w:ind w:firstLine="720"/>
@@ -4428,58 +4714,202 @@
       </w:r>
       <w:r>
         <w:rPr>
+          <w:i w:val="0"/>
+          <w:iCs w:val="0"/>
+        </w:rPr>
+        <w:t>API RESTful</w:t>
+      </w:r>
+      <w:r>
+        <w:rPr/>
+        <w:t>, utilizando</w:t>
+      </w:r>
+      <w:r>
+        <w:rPr/>
+        <w:t xml:space="preserve"> protocolo</w:t>
+      </w:r>
+      <w:r>
+        <w:rPr/>
+        <w:t xml:space="preserve"> HTTPS e dados no formato JSON. </w:t>
+      </w:r>
+      <w:r>
+        <w:rPr/>
+        <w:t xml:space="preserve">No </w:t>
+      </w:r>
+      <w:r>
+        <w:rPr>
           <w:i w:val="1"/>
           <w:iCs w:val="1"/>
         </w:rPr>
-        <w:t>API RESTful</w:t>
+        <w:t>frontend</w:t>
       </w:r>
       <w:r>
         <w:rPr/>
-        <w:t>, utilizando</w:t>
+        <w:t>, a organização será baseada em módulos de funcionalidades.</w:t>
       </w:r>
       <w:r>
         <w:rPr/>
-        <w:t xml:space="preserve"> protocolo</w:t>
+        <w:t xml:space="preserve"> </w:t>
       </w:r>
       <w:r>
         <w:rPr/>
-        <w:t xml:space="preserve"> HTTPS e dados no formato JSON. </w:t>
+        <w:t>Cada módulo concentrará seus próprios componentes visuais, serviços de comunicação com a API e lógica específicas da in</w:t>
       </w:r>
       <w:r>
         <w:rPr/>
+        <w:t xml:space="preserve">terface. </w:t>
+      </w:r>
+    </w:p>
+    <w:p>
+      <w:pPr>
+        <w:pStyle w:val="Normal"/>
+        <w:ind w:firstLine="0"/>
+        <w:jc w:val="both"/>
+        <w:rPr>
+          <w:rFonts w:ascii="Times New Roman" w:hAnsi="Times New Roman" w:eastAsia="Times New Roman" w:cs="Times New Roman"/>
+          <w:noProof w:val="0"/>
+          <w:sz w:val="24"/>
+          <w:szCs w:val="24"/>
+          <w:lang w:val="pt-BR"/>
+        </w:rPr>
+      </w:pPr>
+      <w:r>
+        <w:rPr>
+          <w:rFonts w:ascii="Times New Roman" w:hAnsi="Times New Roman" w:eastAsia="Times New Roman" w:cs="Times New Roman"/>
+          <w:noProof w:val="0"/>
+          <w:sz w:val="24"/>
+          <w:szCs w:val="24"/>
+          <w:lang w:val="pt-BR"/>
+        </w:rPr>
         <w:t xml:space="preserve">No </w:t>
       </w:r>
       <w:r>
         <w:rPr>
+          <w:rFonts w:ascii="Times New Roman" w:hAnsi="Times New Roman" w:eastAsia="Times New Roman" w:cs="Times New Roman"/>
+          <w:noProof w:val="0"/>
+          <w:sz w:val="24"/>
+          <w:szCs w:val="24"/>
+          <w:lang w:val="pt-BR"/>
+        </w:rPr>
+        <w:t>backend</w:t>
+      </w:r>
+      <w:r>
+        <w:rPr>
+          <w:rFonts w:ascii="Times New Roman" w:hAnsi="Times New Roman" w:eastAsia="Times New Roman" w:cs="Times New Roman"/>
+          <w:noProof w:val="0"/>
+          <w:sz w:val="24"/>
+          <w:szCs w:val="24"/>
+          <w:lang w:val="pt-BR"/>
+        </w:rPr>
+        <w:t>, a estrutura está dividida em cinco camadas principais:</w:t>
+      </w:r>
+      <w:r>
+        <w:rPr>
+          <w:rFonts w:ascii="Times New Roman" w:hAnsi="Times New Roman" w:eastAsia="Times New Roman" w:cs="Times New Roman"/>
+          <w:noProof w:val="0"/>
+          <w:sz w:val="24"/>
+          <w:szCs w:val="24"/>
+          <w:lang w:val="pt-BR"/>
+        </w:rPr>
+        <w:t xml:space="preserve"> </w:t>
+      </w:r>
+    </w:p>
+    <w:p>
+      <w:pPr>
+        <w:pStyle w:val="PargrafodaLista"/>
+        <w:numPr>
+          <w:ilvl w:val="0"/>
+          <w:numId w:val="16"/>
+        </w:numPr>
+        <w:jc w:val="both"/>
+        <w:rPr>
+          <w:rFonts w:ascii="Times New Roman" w:hAnsi="Times New Roman" w:eastAsia="Times New Roman" w:cs="Times New Roman"/>
+          <w:noProof w:val="0"/>
+          <w:sz w:val="24"/>
+          <w:szCs w:val="24"/>
+          <w:lang w:val="pt-BR"/>
+        </w:rPr>
+      </w:pPr>
+      <w:r>
+        <w:rPr>
+          <w:rFonts w:ascii="Times New Roman" w:hAnsi="Times New Roman" w:eastAsia="Times New Roman" w:cs="Times New Roman"/>
+          <w:b w:val="1"/>
+          <w:bCs w:val="1"/>
           <w:i w:val="1"/>
           <w:iCs w:val="1"/>
-        </w:rPr>
-        <w:t>frontend</w:t>
-      </w:r>
-      <w:r>
-        <w:rPr/>
-        <w:t>, a organização será baseada em módulos de funcionalidades.</w:t>
-      </w:r>
-      <w:r>
-        <w:rPr/>
+          <w:noProof w:val="0"/>
+          <w:sz w:val="24"/>
+          <w:szCs w:val="24"/>
+          <w:lang w:val="pt-BR"/>
+        </w:rPr>
+        <w:t>Routers</w:t>
+      </w:r>
+      <w:r>
+        <w:rPr>
+          <w:rFonts w:ascii="Times New Roman" w:hAnsi="Times New Roman" w:eastAsia="Times New Roman" w:cs="Times New Roman"/>
+          <w:b w:val="1"/>
+          <w:bCs w:val="1"/>
+          <w:i w:val="1"/>
+          <w:iCs w:val="1"/>
+          <w:noProof w:val="0"/>
+          <w:sz w:val="24"/>
+          <w:szCs w:val="24"/>
+          <w:lang w:val="pt-BR"/>
+        </w:rPr>
+        <w:t>:</w:t>
+      </w:r>
+      <w:r>
+        <w:rPr>
+          <w:rFonts w:ascii="Times New Roman" w:hAnsi="Times New Roman" w:eastAsia="Times New Roman" w:cs="Times New Roman"/>
+          <w:noProof w:val="0"/>
+          <w:sz w:val="24"/>
+          <w:szCs w:val="24"/>
+          <w:lang w:val="pt-BR"/>
+        </w:rPr>
+        <w:t xml:space="preserve"> Módulo responsável pelas rotas HTTP e </w:t>
+      </w:r>
+      <w:r>
+        <w:rPr>
+          <w:rFonts w:ascii="Times New Roman" w:hAnsi="Times New Roman" w:eastAsia="Times New Roman" w:cs="Times New Roman"/>
+          <w:i w:val="1"/>
+          <w:iCs w:val="1"/>
+          <w:noProof w:val="0"/>
+          <w:sz w:val="24"/>
+          <w:szCs w:val="24"/>
+          <w:lang w:val="pt-BR"/>
+        </w:rPr>
+        <w:t>endpoints</w:t>
+      </w:r>
+      <w:r>
+        <w:rPr>
+          <w:rFonts w:ascii="Times New Roman" w:hAnsi="Times New Roman" w:eastAsia="Times New Roman" w:cs="Times New Roman"/>
+          <w:i w:val="1"/>
+          <w:iCs w:val="1"/>
+          <w:noProof w:val="0"/>
+          <w:sz w:val="24"/>
+          <w:szCs w:val="24"/>
+          <w:lang w:val="pt-BR"/>
+        </w:rPr>
         <w:t xml:space="preserve"> </w:t>
       </w:r>
       <w:r>
-        <w:rPr/>
-        <w:t>Cada módulo concentrará seus próprios componentes visuais, serviços de comunicação com a API e lógica específicas da in</w:t>
-      </w:r>
-      <w:r>
-        <w:rPr/>
-        <w:t xml:space="preserve">terface. </w:t>
-      </w:r>
-    </w:p>
-    <w:p>
-      <w:pPr>
-        <w:pStyle w:val="Normal"/>
-        <w:ind w:firstLine="720"/>
+        <w:rPr>
+          <w:rFonts w:ascii="Times New Roman" w:hAnsi="Times New Roman" w:eastAsia="Times New Roman" w:cs="Times New Roman"/>
+          <w:noProof w:val="0"/>
+          <w:sz w:val="24"/>
+          <w:szCs w:val="24"/>
+          <w:lang w:val="pt-BR"/>
+        </w:rPr>
+        <w:t>da API, interceptando requisições, aplicando políticas de autorização de perfis e retornando as respostas.</w:t>
+      </w:r>
+    </w:p>
+    <w:p>
+      <w:pPr>
+        <w:pStyle w:val="PargrafodaLista"/>
+        <w:numPr>
+          <w:ilvl w:val="0"/>
+          <w:numId w:val="17"/>
+        </w:numPr>
         <w:jc w:val="both"/>
-      </w:pPr>
-      <w:r>
         <w:rPr>
           <w:rFonts w:ascii="Times New Roman" w:hAnsi="Times New Roman" w:eastAsia="Times New Roman" w:cs="Times New Roman"/>
           <w:noProof w:val="0"/>
@@ -4487,17 +4917,20 @@
           <w:szCs w:val="24"/>
           <w:lang w:val="pt-BR"/>
         </w:rPr>
-        <w:t xml:space="preserve">No </w:t>
-      </w:r>
-      <w:r>
-        <w:rPr>
-          <w:rFonts w:ascii="Times New Roman" w:hAnsi="Times New Roman" w:eastAsia="Times New Roman" w:cs="Times New Roman"/>
+      </w:pPr>
+      <w:r>
+        <w:rPr>
+          <w:rFonts w:ascii="Times New Roman" w:hAnsi="Times New Roman" w:eastAsia="Times New Roman" w:cs="Times New Roman"/>
+          <w:b w:val="1"/>
+          <w:bCs w:val="1"/>
+          <w:i w:val="1"/>
+          <w:iCs w:val="1"/>
           <w:noProof w:val="0"/>
           <w:sz w:val="24"/>
           <w:szCs w:val="24"/>
           <w:lang w:val="pt-BR"/>
         </w:rPr>
-        <w:t>backend</w:t>
+        <w:t>Services:</w:t>
       </w:r>
       <w:r>
         <w:rPr>
@@ -4507,9 +4940,17 @@
           <w:szCs w:val="24"/>
           <w:lang w:val="pt-BR"/>
         </w:rPr>
-        <w:t xml:space="preserve">, a estrutura será dividida em três camadas. O Model representa as entidades do sistema: Usuário, Solicitação, Chamado e Técnico. Mapeadas diretamente para o banco de dados via ORM. O </w:t>
-      </w:r>
-      <w:r>
+        <w:t xml:space="preserve"> Concentra a lógica de negócio e as orquestrações de fluxo de trabalho (como validação de transição de status e atribuição de técnicos).</w:t>
+      </w:r>
+    </w:p>
+    <w:p>
+      <w:pPr>
+        <w:pStyle w:val="PargrafodaLista"/>
+        <w:numPr>
+          <w:ilvl w:val="0"/>
+          <w:numId w:val="18"/>
+        </w:numPr>
+        <w:jc w:val="both"/>
         <w:rPr>
           <w:rFonts w:ascii="Times New Roman" w:hAnsi="Times New Roman" w:eastAsia="Times New Roman" w:cs="Times New Roman"/>
           <w:noProof w:val="0"/>
@@ -4517,17 +4958,20 @@
           <w:szCs w:val="24"/>
           <w:lang w:val="pt-BR"/>
         </w:rPr>
-        <w:t>Controller</w:t>
-      </w:r>
-      <w:r>
-        <w:rPr>
-          <w:rFonts w:ascii="Times New Roman" w:hAnsi="Times New Roman" w:eastAsia="Times New Roman" w:cs="Times New Roman"/>
+      </w:pPr>
+      <w:r>
+        <w:rPr>
+          <w:rFonts w:ascii="Times New Roman" w:hAnsi="Times New Roman" w:eastAsia="Times New Roman" w:cs="Times New Roman"/>
+          <w:b w:val="1"/>
+          <w:bCs w:val="1"/>
+          <w:i w:val="1"/>
+          <w:iCs w:val="1"/>
           <w:noProof w:val="0"/>
           <w:sz w:val="24"/>
           <w:szCs w:val="24"/>
           <w:lang w:val="pt-BR"/>
         </w:rPr>
-        <w:t xml:space="preserve"> concentra as regras de negócio, como abrir uma solicitação, atribuir um chamado, atualizar o status e gerar indicadores de desempenho. O </w:t>
+        <w:t>Repositories:</w:t>
       </w:r>
       <w:r>
         <w:rPr>
@@ -4537,9 +4981,17 @@
           <w:szCs w:val="24"/>
           <w:lang w:val="pt-BR"/>
         </w:rPr>
-        <w:t>View</w:t>
-      </w:r>
-      <w:r>
+        <w:t xml:space="preserve"> Responsável exclusivo pelas operações de consulta, inserção e atualização no banco de dados através do ORM.</w:t>
+      </w:r>
+    </w:p>
+    <w:p>
+      <w:pPr>
+        <w:pStyle w:val="PargrafodaLista"/>
+        <w:numPr>
+          <w:ilvl w:val="0"/>
+          <w:numId w:val="19"/>
+        </w:numPr>
+        <w:jc w:val="both"/>
         <w:rPr>
           <w:rFonts w:ascii="Times New Roman" w:hAnsi="Times New Roman" w:eastAsia="Times New Roman" w:cs="Times New Roman"/>
           <w:noProof w:val="0"/>
@@ -4547,27 +4999,34 @@
           <w:szCs w:val="24"/>
           <w:lang w:val="pt-BR"/>
         </w:rPr>
-        <w:t xml:space="preserve"> define os contratos de entrada e saída da API, garantindo a validação e serialização dos dados trafegados. As rotas HTTP ficam em um módulo separado de </w:t>
-      </w:r>
-      <w:r>
-        <w:rPr>
-          <w:rFonts w:ascii="Times New Roman" w:hAnsi="Times New Roman" w:eastAsia="Times New Roman" w:cs="Times New Roman"/>
+      </w:pPr>
+      <w:r>
+        <w:rPr>
+          <w:rFonts w:ascii="Times New Roman" w:hAnsi="Times New Roman" w:eastAsia="Times New Roman" w:cs="Times New Roman"/>
+          <w:b w:val="1"/>
+          <w:bCs w:val="1"/>
+          <w:i w:val="1"/>
+          <w:iCs w:val="1"/>
           <w:noProof w:val="0"/>
           <w:sz w:val="24"/>
           <w:szCs w:val="24"/>
           <w:lang w:val="pt-BR"/>
         </w:rPr>
-        <w:t>routers</w:t>
-      </w:r>
-      <w:r>
-        <w:rPr>
-          <w:rFonts w:ascii="Times New Roman" w:hAnsi="Times New Roman" w:eastAsia="Times New Roman" w:cs="Times New Roman"/>
+        <w:t>Models</w:t>
+      </w:r>
+      <w:r>
+        <w:rPr>
+          <w:rFonts w:ascii="Times New Roman" w:hAnsi="Times New Roman" w:eastAsia="Times New Roman" w:cs="Times New Roman"/>
+          <w:b w:val="1"/>
+          <w:bCs w:val="1"/>
+          <w:i w:val="1"/>
+          <w:iCs w:val="1"/>
           <w:noProof w:val="0"/>
           <w:sz w:val="24"/>
           <w:szCs w:val="24"/>
           <w:lang w:val="pt-BR"/>
         </w:rPr>
-        <w:t xml:space="preserve">, responsável por direcionar cada requisição ao </w:t>
+        <w:t>:</w:t>
       </w:r>
       <w:r>
         <w:rPr>
@@ -4577,7 +5036,7 @@
           <w:szCs w:val="24"/>
           <w:lang w:val="pt-BR"/>
         </w:rPr>
-        <w:t>controller</w:t>
+        <w:t xml:space="preserve"> Representa as entidades físicas do banco de dados mapeadas pelo ORM (</w:t>
       </w:r>
       <w:r>
         <w:rPr>
@@ -4587,7 +5046,7 @@
           <w:szCs w:val="24"/>
           <w:lang w:val="pt-BR"/>
         </w:rPr>
-        <w:t xml:space="preserve"> correspondente</w:t>
+        <w:t>SQLAlchemy</w:t>
       </w:r>
       <w:r>
         <w:rPr>
@@ -4597,7 +5056,62 @@
           <w:szCs w:val="24"/>
           <w:lang w:val="pt-BR"/>
         </w:rPr>
-        <w:t>.</w:t>
+        <w:t>).</w:t>
+      </w:r>
+    </w:p>
+    <w:p>
+      <w:pPr>
+        <w:pStyle w:val="PargrafodaLista"/>
+        <w:numPr>
+          <w:ilvl w:val="0"/>
+          <w:numId w:val="20"/>
+        </w:numPr>
+        <w:jc w:val="both"/>
+        <w:rPr>
+          <w:rFonts w:ascii="Times New Roman" w:hAnsi="Times New Roman" w:eastAsia="Times New Roman" w:cs="Times New Roman"/>
+          <w:noProof w:val="0"/>
+          <w:sz w:val="24"/>
+          <w:szCs w:val="24"/>
+          <w:lang w:val="pt-BR"/>
+        </w:rPr>
+      </w:pPr>
+      <w:r>
+        <w:rPr>
+          <w:rFonts w:ascii="Times New Roman" w:hAnsi="Times New Roman" w:eastAsia="Times New Roman" w:cs="Times New Roman"/>
+          <w:b w:val="1"/>
+          <w:bCs w:val="1"/>
+          <w:i w:val="1"/>
+          <w:iCs w:val="1"/>
+          <w:noProof w:val="0"/>
+          <w:sz w:val="24"/>
+          <w:szCs w:val="24"/>
+          <w:lang w:val="pt-BR"/>
+        </w:rPr>
+        <w:t>Schemas</w:t>
+      </w:r>
+      <w:r>
+        <w:rPr>
+          <w:rFonts w:ascii="Times New Roman" w:hAnsi="Times New Roman" w:eastAsia="Times New Roman" w:cs="Times New Roman"/>
+          <w:b w:val="1"/>
+          <w:bCs w:val="1"/>
+          <w:i w:val="1"/>
+          <w:iCs w:val="1"/>
+          <w:noProof w:val="0"/>
+          <w:sz w:val="24"/>
+          <w:szCs w:val="24"/>
+          <w:lang w:val="pt-BR"/>
+        </w:rPr>
+        <w:t>:</w:t>
+      </w:r>
+      <w:r>
+        <w:rPr>
+          <w:rFonts w:ascii="Times New Roman" w:hAnsi="Times New Roman" w:eastAsia="Times New Roman" w:cs="Times New Roman"/>
+          <w:noProof w:val="0"/>
+          <w:sz w:val="24"/>
+          <w:szCs w:val="24"/>
+          <w:lang w:val="pt-BR"/>
+        </w:rPr>
+        <w:t xml:space="preserve"> Define os modelos Pydantic de entrada e saída da API, realizando a validação de formato e a serialização dos dados trafegados."</w:t>
       </w:r>
     </w:p>
     <w:p>
@@ -4661,15 +5175,28 @@
         <w:t xml:space="preserve">O </w:t>
       </w:r>
       <w:r>
+        <w:rPr>
+          <w:i w:val="1"/>
+          <w:iCs w:val="1"/>
+        </w:rPr>
+        <w:t>frontend</w:t>
+      </w:r>
+      <w:r>
+        <w:rPr>
+          <w:i w:val="1"/>
+          <w:iCs w:val="1"/>
+        </w:rPr>
+        <w:t xml:space="preserve"> </w:t>
+      </w:r>
+      <w:r>
         <w:rPr/>
-        <w:t>frontend</w:t>
-      </w:r>
-      <w:r>
-        <w:rPr/>
-        <w:t xml:space="preserve"> não acessará o banco diretamente; toda comunicação será feita por meio do </w:t>
-      </w:r>
-      <w:r>
-        <w:rPr/>
+        <w:t xml:space="preserve">não acessará o banco diretamente; toda comunicação será feita por meio do </w:t>
+      </w:r>
+      <w:r>
+        <w:rPr>
+          <w:i w:val="1"/>
+          <w:iCs w:val="1"/>
+        </w:rPr>
         <w:t>backend</w:t>
       </w:r>
       <w:r>
@@ -4711,7 +5238,7 @@
     </w:p>
     <w:p>
       <w:pPr>
-        <w:spacing w:line="259" w:lineRule="auto"/>
+        <w:spacing w:after="120" w:afterAutospacing="off" w:line="259" w:lineRule="auto"/>
         <w:ind w:firstLine="576"/>
         <w:jc w:val="both"/>
       </w:pPr>
@@ -4723,17 +5250,19 @@
           <w:szCs w:val="24"/>
           <w:lang w:val="pt-BR"/>
         </w:rPr>
-        <w:t>O projeto deverá aderir aos padrões REST para a interface cliente-servidor, feature-</w:t>
-      </w:r>
-      <w:r>
-        <w:rPr>
-          <w:rFonts w:ascii="Times New Roman" w:hAnsi="Times New Roman" w:eastAsia="Times New Roman" w:cs="Times New Roman"/>
+        <w:t xml:space="preserve">O projeto deverá aderir aos padrões REST para a interface cliente-servidor, feature-based para os componentes de software e a uma Arquitetura em Camadas </w:t>
+      </w:r>
+      <w:r>
+        <w:rPr>
+          <w:rFonts w:ascii="Times New Roman" w:hAnsi="Times New Roman" w:eastAsia="Times New Roman" w:cs="Times New Roman"/>
+          <w:i w:val="1"/>
+          <w:iCs w:val="1"/>
           <w:noProof w:val="0"/>
           <w:sz w:val="24"/>
           <w:szCs w:val="24"/>
           <w:lang w:val="pt-BR"/>
         </w:rPr>
-        <w:t>based</w:t>
+        <w:t>(Service-Repository)</w:t>
       </w:r>
       <w:r>
         <w:rPr>
@@ -4743,11 +5272,13 @@
           <w:szCs w:val="24"/>
           <w:lang w:val="pt-BR"/>
         </w:rPr>
-        <w:t xml:space="preserve"> para os componentes de software e MVC para a estrutura e dependências do </w:t>
-      </w:r>
-      <w:r>
-        <w:rPr>
-          <w:rFonts w:ascii="Times New Roman" w:hAnsi="Times New Roman" w:eastAsia="Times New Roman" w:cs="Times New Roman"/>
+        <w:t xml:space="preserve"> para a estrutura do </w:t>
+      </w:r>
+      <w:r>
+        <w:rPr>
+          <w:rFonts w:ascii="Times New Roman" w:hAnsi="Times New Roman" w:eastAsia="Times New Roman" w:cs="Times New Roman"/>
+          <w:i w:val="1"/>
+          <w:iCs w:val="1"/>
           <w:noProof w:val="0"/>
           <w:sz w:val="24"/>
           <w:szCs w:val="24"/>
@@ -4763,17 +5294,19 @@
           <w:szCs w:val="24"/>
           <w:lang w:val="pt-BR"/>
         </w:rPr>
-        <w:t xml:space="preserve">. A escolha se justifica pois o padrão </w:t>
-      </w:r>
-      <w:r>
-        <w:rPr>
-          <w:rFonts w:ascii="Times New Roman" w:hAnsi="Times New Roman" w:eastAsia="Times New Roman" w:cs="Times New Roman"/>
+        <w:t xml:space="preserve">. A escolha se justifica pois o padrão RESTful é simples, escalável e rápido; o </w:t>
+      </w:r>
+      <w:r>
+        <w:rPr>
+          <w:rFonts w:ascii="Times New Roman" w:hAnsi="Times New Roman" w:eastAsia="Times New Roman" w:cs="Times New Roman"/>
+          <w:i w:val="1"/>
+          <w:iCs w:val="1"/>
           <w:noProof w:val="0"/>
           <w:sz w:val="24"/>
           <w:szCs w:val="24"/>
           <w:lang w:val="pt-BR"/>
         </w:rPr>
-        <w:t>RESTful</w:t>
+        <w:t>feature-based</w:t>
       </w:r>
       <w:r>
         <w:rPr>
@@ -4783,165 +5316,165 @@
           <w:szCs w:val="24"/>
           <w:lang w:val="pt-BR"/>
         </w:rPr>
-        <w:t xml:space="preserve"> é simples, escalável e rápido; o feature-</w:t>
-      </w:r>
-      <w:r>
-        <w:rPr>
-          <w:rFonts w:ascii="Times New Roman" w:hAnsi="Times New Roman" w:eastAsia="Times New Roman" w:cs="Times New Roman"/>
-          <w:noProof w:val="0"/>
-          <w:sz w:val="24"/>
-          <w:szCs w:val="24"/>
-          <w:lang w:val="pt-BR"/>
-        </w:rPr>
-        <w:t>based</w:t>
-      </w:r>
-      <w:r>
-        <w:rPr>
-          <w:rFonts w:ascii="Times New Roman" w:hAnsi="Times New Roman" w:eastAsia="Times New Roman" w:cs="Times New Roman"/>
-          <w:noProof w:val="0"/>
-          <w:sz w:val="24"/>
-          <w:szCs w:val="24"/>
-          <w:lang w:val="pt-BR"/>
-        </w:rPr>
-        <w:t xml:space="preserve"> permite que múltiplas partes sejam desenvolvidas simultaneamente; e o MVC organiza o </w:t>
-      </w:r>
-      <w:r>
-        <w:rPr>
-          <w:rFonts w:ascii="Times New Roman" w:hAnsi="Times New Roman" w:eastAsia="Times New Roman" w:cs="Times New Roman"/>
-          <w:noProof w:val="0"/>
-          <w:sz w:val="24"/>
-          <w:szCs w:val="24"/>
-          <w:lang w:val="pt-BR"/>
-        </w:rPr>
-        <w:t>backend</w:t>
-      </w:r>
-      <w:r>
-        <w:rPr>
-          <w:rFonts w:ascii="Times New Roman" w:hAnsi="Times New Roman" w:eastAsia="Times New Roman" w:cs="Times New Roman"/>
-          <w:noProof w:val="0"/>
-          <w:sz w:val="24"/>
-          <w:szCs w:val="24"/>
-          <w:lang w:val="pt-BR"/>
-        </w:rPr>
-        <w:t xml:space="preserve"> em camadas de responsabilidade clara e testável.</w:t>
-      </w:r>
-    </w:p>
-    <w:p>
-      <w:pPr>
-        <w:spacing w:line="259" w:lineRule="auto"/>
+        <w:t xml:space="preserve"> permite que múltiplas partes sejam desenvolvidas simultaneamente; e a Arquitetura em Camadas organiza o backend em responsabilidades isoladas e testáveis.</w:t>
+      </w:r>
+    </w:p>
+    <w:p>
+      <w:pPr>
+        <w:spacing w:after="120" w:afterAutospacing="off" w:line="259" w:lineRule="auto"/>
         <w:ind w:firstLine="720"/>
         <w:jc w:val="both"/>
       </w:pPr>
       <w:r>
+        <w:rPr/>
         <w:t>Além disso, a</w:t>
       </w:r>
       <w:r>
+        <w:rPr/>
         <w:t xml:space="preserve">s partes do projeto desenvolvidas em Python deverão empregar </w:t>
       </w:r>
       <w:r>
         <w:rPr>
-          <w:i/>
-          <w:iCs/>
-        </w:rPr>
-        <w:t>type hinting</w:t>
-      </w:r>
-      <w:r>
+          <w:i w:val="1"/>
+          <w:iCs w:val="1"/>
+        </w:rPr>
+        <w:t>type</w:t>
+      </w:r>
+      <w:r>
+        <w:rPr>
+          <w:i w:val="1"/>
+          <w:iCs w:val="1"/>
+        </w:rPr>
+        <w:t xml:space="preserve"> </w:t>
+      </w:r>
+      <w:r>
+        <w:rPr>
+          <w:i w:val="1"/>
+          <w:iCs w:val="1"/>
+        </w:rPr>
+        <w:t>hinting</w:t>
+      </w:r>
+      <w:r>
+        <w:rPr/>
         <w:t xml:space="preserve"> na</w:t>
       </w:r>
       <w:r>
+        <w:rPr/>
         <w:t>s</w:t>
       </w:r>
       <w:r>
+        <w:rPr/>
         <w:t xml:space="preserve"> declaraç</w:t>
       </w:r>
       <w:r>
+        <w:rPr/>
         <w:t>ões</w:t>
       </w:r>
       <w:r>
+        <w:rPr/>
         <w:t xml:space="preserve"> de funç</w:t>
       </w:r>
       <w:r>
+        <w:rPr/>
         <w:t>ão</w:t>
       </w:r>
       <w:r>
+        <w:rPr/>
         <w:t xml:space="preserve"> e</w:t>
       </w:r>
       <w:r>
+        <w:rPr/>
         <w:t xml:space="preserve"> documentar seus comportamento</w:t>
       </w:r>
       <w:r>
+        <w:rPr/>
         <w:t>s</w:t>
       </w:r>
       <w:r>
+        <w:rPr/>
         <w:t xml:space="preserve"> e casos de uso. Isso garante que qualquer desenvolvedor ou editor de código possa inferir o uso de qualquer função importante.</w:t>
       </w:r>
     </w:p>
     <w:p>
       <w:pPr>
-        <w:spacing w:line="259" w:lineRule="auto"/>
-        <w:rPr>
-          <w:color w:val="FF0000"/>
-        </w:rPr>
-      </w:pPr>
-    </w:p>
-    <w:p>
-      <w:pPr>
-        <w:spacing w:line="259" w:lineRule="auto"/>
+        <w:spacing w:after="120" w:afterAutospacing="off" w:line="259" w:lineRule="auto"/>
         <w:ind w:firstLine="720"/>
         <w:jc w:val="both"/>
       </w:pPr>
       <w:r>
+        <w:rPr/>
         <w:t xml:space="preserve">Quanto ao Git, ao desenvolver o projeto, cada </w:t>
       </w:r>
       <w:r>
+        <w:rPr/>
         <w:t>funcionalidade de negócio</w:t>
       </w:r>
       <w:r>
+        <w:rPr/>
         <w:t xml:space="preserve"> deve ser desenvolvid</w:t>
       </w:r>
       <w:r>
+        <w:rPr/>
         <w:t>a</w:t>
       </w:r>
       <w:r>
+        <w:rPr/>
         <w:t xml:space="preserve"> em uma </w:t>
       </w:r>
       <w:r>
         <w:rPr>
-          <w:i/>
-          <w:iCs/>
+          <w:i w:val="1"/>
+          <w:iCs w:val="1"/>
         </w:rPr>
         <w:t>branch</w:t>
       </w:r>
       <w:r>
+        <w:rPr/>
         <w:t xml:space="preserve"> diferente, e depois unid</w:t>
       </w:r>
       <w:r>
+        <w:rPr/>
         <w:t>a</w:t>
       </w:r>
       <w:r>
-        <w:t xml:space="preserve"> ao tronco. A nomenclatura de cada branch deve ser do tipo </w:t>
-      </w:r>
-      <w:r>
-        <w:rPr>
-          <w:i/>
-          <w:iCs/>
+        <w:rPr/>
+        <w:t xml:space="preserve"> ao tronco. A nomenclatura de cada </w:t>
+      </w:r>
+      <w:r>
+        <w:rPr>
+          <w:i w:val="1"/>
+          <w:iCs w:val="1"/>
+        </w:rPr>
+        <w:t>branch</w:t>
+      </w:r>
+      <w:r>
+        <w:rPr/>
+        <w:t xml:space="preserve"> deve ser do tipo </w:t>
+      </w:r>
+      <w:r>
+        <w:rPr>
+          <w:i w:val="1"/>
+          <w:iCs w:val="1"/>
         </w:rPr>
         <w:t>feature</w:t>
       </w:r>
       <w:r>
         <w:rPr>
-          <w:i/>
-          <w:iCs/>
+          <w:i w:val="1"/>
+          <w:iCs w:val="1"/>
         </w:rPr>
         <w:t>-[nome do componente].</w:t>
       </w:r>
       <w:r>
+        <w:rPr/>
         <w:t xml:space="preserve"> Se feito da forma correta, todos poderão desenvolver suas partes simultaneamente, e então integrar tudo</w:t>
       </w:r>
       <w:r>
+        <w:rPr/>
         <w:t xml:space="preserve"> com mínimos conflitos</w:t>
       </w:r>
       <w:r>
+        <w:rPr/>
         <w:t>.</w:t>
       </w:r>
     </w:p>
@@ -5085,7 +5618,7 @@
       </w:pPr>
       <w:r>
         <w:drawing>
-          <wp:inline wp14:editId="6C4D6D1E" wp14:anchorId="4C24D391">
+          <wp:inline wp14:editId="0D0E581F" wp14:anchorId="4C24D391">
             <wp:extent cx="5343525" cy="4045431"/>
             <wp:effectExtent l="0" t="0" r="0" b="0"/>
             <wp:docPr id="953591958" name="drawing"/>
@@ -5251,7 +5784,7 @@
       </w:pPr>
       <w:r>
         <w:drawing>
-          <wp:inline wp14:editId="14564E1F" wp14:anchorId="284C418D">
+          <wp:inline wp14:editId="56D27487" wp14:anchorId="284C418D">
             <wp:extent cx="5404175" cy="3695700"/>
             <wp:effectExtent l="0" t="0" r="0" b="0"/>
             <wp:docPr id="270259406" name="drawing"/>
@@ -5411,7 +5944,7 @@
       </w:pPr>
       <w:r>
         <w:drawing>
-          <wp:inline wp14:editId="446F9E3F" wp14:anchorId="6DA945C8">
+          <wp:inline wp14:editId="659A3FE4" wp14:anchorId="6DA945C8">
             <wp:extent cx="4333389" cy="3979483"/>
             <wp:effectExtent l="0" t="0" r="0" b="0"/>
             <wp:docPr id="442901543" name="drawing"/>
@@ -5634,29 +6167,44 @@
         <w:jc w:val="both"/>
       </w:pPr>
       <w:r>
+        <w:rPr/>
         <w:t>Responsável por controlar o acesso ao sistema. Gerencia o login do usuário, a geração e validação de tokens de sessão, e a identificação do perfil de acesso. É o ponto de entrada obrigatório para qualquer outra funcionalidade</w:t>
       </w:r>
       <w:r>
+        <w:rPr/>
         <w:t xml:space="preserve">, </w:t>
       </w:r>
       <w:r>
-        <w:t xml:space="preserve">todos os demais módulos dependem de uma sessão autenticada para operar. Comunica-se com o backend via </w:t>
-      </w:r>
-      <w:r>
-        <w:rPr>
-          <w:i/>
-          <w:iCs/>
+        <w:rPr/>
+        <w:t xml:space="preserve">todos os demais módulos dependem de uma sessão autenticada para operar. Comunica-se com o </w:t>
+      </w:r>
+      <w:r>
+        <w:rPr/>
+        <w:t>backend</w:t>
+      </w:r>
+      <w:r>
+        <w:rPr/>
+        <w:t xml:space="preserve"> via </w:t>
+      </w:r>
+      <w:r>
+        <w:rPr>
+          <w:i w:val="1"/>
+          <w:iCs w:val="1"/>
         </w:rPr>
         <w:t>endpoint</w:t>
       </w:r>
       <w:r>
-        <w:t xml:space="preserve"> REST /auth, recebendo credenciais e retornando um token JWT que acompanhará as requisições subsequentes.</w:t>
-      </w:r>
-    </w:p>
-    <w:p>
-      <w:pPr>
-        <w:jc w:val="both"/>
-      </w:pPr>
+        <w:rPr/>
+        <w:t xml:space="preserve"> REST /</w:t>
+      </w:r>
+      <w:r>
+        <w:rPr/>
+        <w:t>auth</w:t>
+      </w:r>
+      <w:r>
+        <w:rPr/>
+        <w:t>, recebendo credenciais e retornando um token JWT que acompanhará as requisições subsequentes.</w:t>
+      </w:r>
     </w:p>
     <w:p>
       <w:r>
@@ -5953,7 +6501,7 @@
       </w:pPr>
       <w:r>
         <w:drawing>
-          <wp:inline wp14:editId="2215B84B" wp14:anchorId="0828AF42">
+          <wp:inline wp14:editId="106B66A6" wp14:anchorId="0828AF42">
             <wp:extent cx="5587161" cy="7790913"/>
             <wp:effectExtent l="0" t="0" r="0" b="0"/>
             <wp:docPr id="1065282761" name="drawing"/>
@@ -6080,6 +6628,8 @@
         <w:pStyle w:val="Ttulo3"/>
         <w:rPr>
           <w:rFonts w:ascii="Times New Roman" w:hAnsi="Times New Roman"/>
+          <w:sz w:val="24"/>
+          <w:szCs w:val="24"/>
         </w:rPr>
       </w:pPr>
       <w:bookmarkStart w:name="_Toc1492700777" w:id="44"/>
@@ -6089,18 +6639,24 @@
       <w:r>
         <w:rPr>
           <w:rFonts w:ascii="Times New Roman" w:hAnsi="Times New Roman"/>
+          <w:sz w:val="24"/>
+          <w:szCs w:val="24"/>
         </w:rPr>
         <w:t xml:space="preserve">Visão </w:t>
       </w:r>
       <w:r>
         <w:rPr>
           <w:rFonts w:ascii="Times New Roman" w:hAnsi="Times New Roman"/>
+          <w:sz w:val="24"/>
+          <w:szCs w:val="24"/>
         </w:rPr>
         <w:t>e</w:t>
       </w:r>
       <w:r>
         <w:rPr>
           <w:rFonts w:ascii="Times New Roman" w:hAnsi="Times New Roman"/>
+          <w:sz w:val="24"/>
+          <w:szCs w:val="24"/>
         </w:rPr>
         <w:t>strutural</w:t>
       </w:r>
@@ -6448,6 +7004,8 @@
       <w:r>
         <w:rPr>
           <w:rFonts w:ascii="Times New Roman" w:hAnsi="Times New Roman" w:eastAsia="Times New Roman" w:cs="Times New Roman"/>
+          <w:b w:val="1"/>
+          <w:bCs w:val="1"/>
           <w:sz w:val="24"/>
           <w:szCs w:val="24"/>
         </w:rPr>
@@ -6459,7 +7017,37 @@
           <w:sz w:val="24"/>
           <w:szCs w:val="24"/>
         </w:rPr>
-        <w:t>Estruturado com base no padrão MVC.</w:t>
+        <w:t xml:space="preserve">Estruturado sob uma Arquitetura em Camadas com padrão </w:t>
+      </w:r>
+      <w:r>
+        <w:rPr>
+          <w:rFonts w:ascii="Times New Roman" w:hAnsi="Times New Roman" w:eastAsia="Times New Roman" w:cs="Times New Roman"/>
+          <w:i w:val="1"/>
+          <w:iCs w:val="1"/>
+          <w:sz w:val="24"/>
+          <w:szCs w:val="24"/>
+        </w:rPr>
+        <w:t>Service-</w:t>
+      </w:r>
+      <w:r>
+        <w:rPr>
+          <w:rFonts w:ascii="Times New Roman" w:hAnsi="Times New Roman" w:eastAsia="Times New Roman" w:cs="Times New Roman"/>
+          <w:i w:val="1"/>
+          <w:iCs w:val="1"/>
+          <w:sz w:val="24"/>
+          <w:szCs w:val="24"/>
+        </w:rPr>
+        <w:t>Repository</w:t>
+      </w:r>
+      <w:r>
+        <w:rPr>
+          <w:rFonts w:ascii="Times New Roman" w:hAnsi="Times New Roman" w:eastAsia="Times New Roman" w:cs="Times New Roman"/>
+          <w:i w:val="1"/>
+          <w:iCs w:val="1"/>
+          <w:sz w:val="24"/>
+          <w:szCs w:val="24"/>
+        </w:rPr>
+        <w:t>.</w:t>
       </w:r>
     </w:p>
     <w:p>
@@ -6533,14 +7121,14 @@
       <w:r>
         <w:rPr>
           <w:rFonts w:ascii="Times New Roman" w:hAnsi="Times New Roman" w:eastAsia="Times New Roman" w:cs="Times New Roman"/>
-          <w:b w:val="1"/>
-          <w:bCs w:val="1"/>
+          <w:i w:val="1"/>
+          <w:iCs w:val="1"/>
           <w:noProof w:val="0"/>
           <w:sz w:val="24"/>
           <w:szCs w:val="24"/>
           <w:lang w:val="pt-BR"/>
         </w:rPr>
-        <w:t>Model:</w:t>
+        <w:t>Routers</w:t>
       </w:r>
       <w:r>
         <w:rPr>
@@ -6550,7 +7138,47 @@
           <w:szCs w:val="24"/>
           <w:lang w:val="pt-BR"/>
         </w:rPr>
-        <w:t xml:space="preserve"> Representa as entidades do domínio mapeadas via ORM, Usuário, Solicitação, Chamado e Técnico, sem lógica de negócio embutida.</w:t>
+        <w:t xml:space="preserve">: Definição dos </w:t>
+      </w:r>
+      <w:r>
+        <w:rPr>
+          <w:rFonts w:ascii="Times New Roman" w:hAnsi="Times New Roman" w:eastAsia="Times New Roman" w:cs="Times New Roman"/>
+          <w:noProof w:val="0"/>
+          <w:sz w:val="24"/>
+          <w:szCs w:val="24"/>
+          <w:lang w:val="pt-BR"/>
+        </w:rPr>
+        <w:t>endpoints</w:t>
+      </w:r>
+      <w:r>
+        <w:rPr>
+          <w:rFonts w:ascii="Times New Roman" w:hAnsi="Times New Roman" w:eastAsia="Times New Roman" w:cs="Times New Roman"/>
+          <w:noProof w:val="0"/>
+          <w:sz w:val="24"/>
+          <w:szCs w:val="24"/>
+          <w:lang w:val="pt-BR"/>
+        </w:rPr>
+        <w:t xml:space="preserve"> </w:t>
+      </w:r>
+      <w:r>
+        <w:rPr>
+          <w:rFonts w:ascii="Times New Roman" w:hAnsi="Times New Roman" w:eastAsia="Times New Roman" w:cs="Times New Roman"/>
+          <w:noProof w:val="0"/>
+          <w:sz w:val="24"/>
+          <w:szCs w:val="24"/>
+          <w:lang w:val="pt-BR"/>
+        </w:rPr>
+        <w:t>RESTful</w:t>
+      </w:r>
+      <w:r>
+        <w:rPr>
+          <w:rFonts w:ascii="Times New Roman" w:hAnsi="Times New Roman" w:eastAsia="Times New Roman" w:cs="Times New Roman"/>
+          <w:noProof w:val="0"/>
+          <w:sz w:val="24"/>
+          <w:szCs w:val="24"/>
+          <w:lang w:val="pt-BR"/>
+        </w:rPr>
+        <w:t xml:space="preserve"> do sistema. Recebe a chamada HTTP, valida credenciais de sessão e delega a computação para a camada de Service correspondente. </w:t>
       </w:r>
     </w:p>
     <w:p>
@@ -6572,14 +7200,14 @@
       <w:r>
         <w:rPr>
           <w:rFonts w:ascii="Times New Roman" w:hAnsi="Times New Roman" w:eastAsia="Times New Roman" w:cs="Times New Roman"/>
-          <w:b w:val="1"/>
-          <w:bCs w:val="1"/>
+          <w:i w:val="1"/>
+          <w:iCs w:val="1"/>
           <w:noProof w:val="0"/>
           <w:sz w:val="24"/>
           <w:szCs w:val="24"/>
           <w:lang w:val="pt-BR"/>
         </w:rPr>
-        <w:t>Controller:</w:t>
+        <w:t>Services</w:t>
       </w:r>
       <w:r>
         <w:rPr>
@@ -6589,7 +7217,7 @@
           <w:szCs w:val="24"/>
           <w:lang w:val="pt-BR"/>
         </w:rPr>
-        <w:t xml:space="preserve"> Concentra as regras de negócio, orquestrando operações como abrir solicitação, atribuir chamado, atualizar status e gerar indicadores de desempenho.</w:t>
+        <w:t xml:space="preserve">: Onde reside a lógica de negócio do sistema. Recebe dados validados, aplica regras corporativas e gerencia o fluxo de chamadas aos repositórios. </w:t>
       </w:r>
     </w:p>
     <w:p>
@@ -6602,6 +7230,8 @@
         <w:jc w:val="both"/>
         <w:rPr>
           <w:rFonts w:ascii="Times New Roman" w:hAnsi="Times New Roman" w:eastAsia="Times New Roman" w:cs="Times New Roman"/>
+          <w:i w:val="1"/>
+          <w:iCs w:val="1"/>
           <w:noProof w:val="0"/>
           <w:sz w:val="24"/>
           <w:szCs w:val="24"/>
@@ -6611,14 +7241,14 @@
       <w:r>
         <w:rPr>
           <w:rFonts w:ascii="Times New Roman" w:hAnsi="Times New Roman" w:eastAsia="Times New Roman" w:cs="Times New Roman"/>
-          <w:b w:val="1"/>
-          <w:bCs w:val="1"/>
+          <w:i w:val="1"/>
+          <w:iCs w:val="1"/>
           <w:noProof w:val="0"/>
           <w:sz w:val="24"/>
           <w:szCs w:val="24"/>
           <w:lang w:val="pt-BR"/>
         </w:rPr>
-        <w:t>View:</w:t>
+        <w:t>Repositories</w:t>
       </w:r>
       <w:r>
         <w:rPr>
@@ -6628,7 +7258,27 @@
           <w:szCs w:val="24"/>
           <w:lang w:val="pt-BR"/>
         </w:rPr>
-        <w:t xml:space="preserve"> Schemas Pydantic que definem o formato das requisições e respostas da API, garantindo a validação e serialização dos dados.</w:t>
+        <w:t xml:space="preserve">: Camada responsável pela interação com o banco de dados via </w:t>
+      </w:r>
+      <w:r>
+        <w:rPr>
+          <w:rFonts w:ascii="Times New Roman" w:hAnsi="Times New Roman" w:eastAsia="Times New Roman" w:cs="Times New Roman"/>
+          <w:noProof w:val="0"/>
+          <w:sz w:val="24"/>
+          <w:szCs w:val="24"/>
+          <w:lang w:val="pt-BR"/>
+        </w:rPr>
+        <w:t>SQLAlchemy</w:t>
+      </w:r>
+      <w:r>
+        <w:rPr>
+          <w:rFonts w:ascii="Times New Roman" w:hAnsi="Times New Roman" w:eastAsia="Times New Roman" w:cs="Times New Roman"/>
+          <w:noProof w:val="0"/>
+          <w:sz w:val="24"/>
+          <w:szCs w:val="24"/>
+          <w:lang w:val="pt-BR"/>
+        </w:rPr>
+        <w:t>. Executa comandos SQL e gerencia a transação de persistência.</w:t>
       </w:r>
     </w:p>
     <w:p>
@@ -6650,26 +7300,24 @@
       <w:r>
         <w:rPr>
           <w:rFonts w:ascii="Times New Roman" w:hAnsi="Times New Roman" w:eastAsia="Times New Roman" w:cs="Times New Roman"/>
-          <w:b w:val="1"/>
-          <w:bCs w:val="1"/>
+          <w:i w:val="1"/>
+          <w:iCs w:val="1"/>
           <w:noProof w:val="0"/>
           <w:sz w:val="24"/>
           <w:szCs w:val="24"/>
           <w:lang w:val="pt-BR"/>
         </w:rPr>
-        <w:t>Routers</w:t>
-      </w:r>
-      <w:r>
-        <w:rPr>
-          <w:rFonts w:ascii="Times New Roman" w:hAnsi="Times New Roman" w:eastAsia="Times New Roman" w:cs="Times New Roman"/>
-          <w:b w:val="1"/>
-          <w:bCs w:val="1"/>
+        <w:t>Models</w:t>
+      </w:r>
+      <w:r>
+        <w:rPr>
+          <w:rFonts w:ascii="Times New Roman" w:hAnsi="Times New Roman" w:eastAsia="Times New Roman" w:cs="Times New Roman"/>
           <w:noProof w:val="0"/>
           <w:sz w:val="24"/>
           <w:szCs w:val="24"/>
           <w:lang w:val="pt-BR"/>
         </w:rPr>
-        <w:t>:</w:t>
+        <w:t xml:space="preserve">: Mapeamento de tabelas físicas do banco de dados para classes Python usando </w:t>
       </w:r>
       <w:r>
         <w:rPr>
@@ -6679,7 +7327,7 @@
           <w:szCs w:val="24"/>
           <w:lang w:val="pt-BR"/>
         </w:rPr>
-        <w:t xml:space="preserve"> Módulo que mapeia as rotas HTTP aos </w:t>
+        <w:t>SQLAlchemy</w:t>
       </w:r>
       <w:r>
         <w:rPr>
@@ -6689,9 +7337,17 @@
           <w:szCs w:val="24"/>
           <w:lang w:val="pt-BR"/>
         </w:rPr>
-        <w:t>controllers</w:t>
-      </w:r>
-      <w:r>
+        <w:t xml:space="preserve">. </w:t>
+      </w:r>
+    </w:p>
+    <w:p>
+      <w:pPr>
+        <w:pStyle w:val="PargrafodaLista"/>
+        <w:numPr>
+          <w:ilvl w:val="0"/>
+          <w:numId w:val="9"/>
+        </w:numPr>
+        <w:jc w:val="both"/>
         <w:rPr>
           <w:rFonts w:ascii="Times New Roman" w:hAnsi="Times New Roman" w:eastAsia="Times New Roman" w:cs="Times New Roman"/>
           <w:noProof w:val="0"/>
@@ -6699,7 +7355,48 @@
           <w:szCs w:val="24"/>
           <w:lang w:val="pt-BR"/>
         </w:rPr>
-        <w:t xml:space="preserve"> correspondentes, sem lógica embutida.</w:t>
+      </w:pPr>
+      <w:r>
+        <w:rPr>
+          <w:rFonts w:ascii="Times New Roman" w:hAnsi="Times New Roman" w:eastAsia="Times New Roman" w:cs="Times New Roman"/>
+          <w:i w:val="1"/>
+          <w:iCs w:val="1"/>
+          <w:noProof w:val="0"/>
+          <w:sz w:val="24"/>
+          <w:szCs w:val="24"/>
+          <w:lang w:val="pt-BR"/>
+        </w:rPr>
+        <w:t>Schemas</w:t>
+      </w:r>
+      <w:r>
+        <w:rPr>
+          <w:rFonts w:ascii="Times New Roman" w:hAnsi="Times New Roman" w:eastAsia="Times New Roman" w:cs="Times New Roman"/>
+          <w:noProof w:val="0"/>
+          <w:sz w:val="24"/>
+          <w:szCs w:val="24"/>
+          <w:lang w:val="pt-BR"/>
+        </w:rPr>
+        <w:t xml:space="preserve">: Modelos </w:t>
+      </w:r>
+      <w:r>
+        <w:rPr>
+          <w:rFonts w:ascii="Times New Roman" w:hAnsi="Times New Roman" w:eastAsia="Times New Roman" w:cs="Times New Roman"/>
+          <w:noProof w:val="0"/>
+          <w:sz w:val="24"/>
+          <w:szCs w:val="24"/>
+          <w:lang w:val="pt-BR"/>
+        </w:rPr>
+        <w:t>Pydantic</w:t>
+      </w:r>
+      <w:r>
+        <w:rPr>
+          <w:rFonts w:ascii="Times New Roman" w:hAnsi="Times New Roman" w:eastAsia="Times New Roman" w:cs="Times New Roman"/>
+          <w:noProof w:val="0"/>
+          <w:sz w:val="24"/>
+          <w:szCs w:val="24"/>
+          <w:lang w:val="pt-BR"/>
+        </w:rPr>
+        <w:t xml:space="preserve"> para declaração dos contratos das APIs (corpo de requisição e resposta)</w:t>
       </w:r>
     </w:p>
     <w:p>
@@ -6930,10 +7627,10 @@
       <w:r>
         <w:rPr>
           <w:rFonts w:ascii="Times New Roman" w:hAnsi="Times New Roman" w:eastAsia="Times New Roman" w:cs="Times New Roman"/>
-          <w:b/>
-          <w:bCs/>
-          <w:i/>
-          <w:iCs/>
+          <w:b w:val="1"/>
+          <w:bCs w:val="1"/>
+          <w:i w:val="1"/>
+          <w:iCs w:val="1"/>
           <w:sz w:val="24"/>
           <w:szCs w:val="24"/>
         </w:rPr>
@@ -6942,8 +7639,8 @@
       <w:r>
         <w:rPr>
           <w:rFonts w:ascii="Times New Roman" w:hAnsi="Times New Roman" w:eastAsia="Times New Roman" w:cs="Times New Roman"/>
-          <w:b/>
-          <w:bCs/>
+          <w:b w:val="1"/>
+          <w:bCs w:val="1"/>
           <w:sz w:val="24"/>
           <w:szCs w:val="24"/>
         </w:rPr>
@@ -6960,8 +7657,8 @@
       <w:r>
         <w:rPr>
           <w:rFonts w:ascii="Times New Roman" w:hAnsi="Times New Roman" w:eastAsia="Times New Roman" w:cs="Times New Roman"/>
-          <w:i/>
-          <w:iCs/>
+          <w:i w:val="1"/>
+          <w:iCs w:val="1"/>
           <w:sz w:val="24"/>
           <w:szCs w:val="24"/>
         </w:rPr>
@@ -6978,8 +7675,8 @@
       <w:r>
         <w:rPr>
           <w:rFonts w:ascii="Times New Roman" w:hAnsi="Times New Roman" w:eastAsia="Times New Roman" w:cs="Times New Roman"/>
-          <w:i/>
-          <w:iCs/>
+          <w:i w:val="1"/>
+          <w:iCs w:val="1"/>
           <w:sz w:val="24"/>
           <w:szCs w:val="24"/>
         </w:rPr>
@@ -6991,35 +7688,79 @@
           <w:sz w:val="24"/>
           <w:szCs w:val="24"/>
         </w:rPr>
-        <w:t xml:space="preserve"> não possui qualquer rota de acesso direto ao PostgreSQL, garantindo que toda operação passe obrigatoriamente pela validação dos casos de uso. O fluxo estrutural de comunicação segue uma ordem estrita: o usuário interage com a interface visual no frontend; este dispara uma requisição JSON para a API RESTful; o </w:t>
-      </w:r>
-      <w:r>
-        <w:rPr>
-          <w:rFonts w:ascii="Times New Roman" w:hAnsi="Times New Roman" w:eastAsia="Times New Roman" w:cs="Times New Roman"/>
-          <w:i/>
-          <w:iCs/>
-          <w:sz w:val="24"/>
-          <w:szCs w:val="24"/>
-        </w:rPr>
-        <w:t>backend</w:t>
-      </w:r>
-      <w:r>
-        <w:rPr>
-          <w:rFonts w:ascii="Times New Roman" w:hAnsi="Times New Roman" w:eastAsia="Times New Roman" w:cs="Times New Roman"/>
-          <w:sz w:val="24"/>
-          <w:szCs w:val="24"/>
-        </w:rPr>
-        <w:t xml:space="preserve"> recebe a requisição, processa a lógica de negócio através da </w:t>
-      </w:r>
-      <w:r>
-        <w:rPr>
-          <w:rFonts w:ascii="Times New Roman" w:hAnsi="Times New Roman" w:eastAsia="Times New Roman" w:cs="Times New Roman"/>
-          <w:i/>
-          <w:iCs/>
-          <w:sz w:val="24"/>
-          <w:szCs w:val="24"/>
-        </w:rPr>
-        <w:t>Clean Architecture</w:t>
+        <w:t xml:space="preserve"> não possui qualquer rota de acesso direto ao PostgreSQL, garantindo que toda operação passe obrigatoriamente pela validação dos casos de uso. O fluxo estrutural de comunicação segue uma ordem estrita: o usuário interage com a interface visual no </w:t>
+      </w:r>
+      <w:r>
+        <w:rPr>
+          <w:rFonts w:ascii="Times New Roman" w:hAnsi="Times New Roman" w:eastAsia="Times New Roman" w:cs="Times New Roman"/>
+          <w:i w:val="1"/>
+          <w:iCs w:val="1"/>
+          <w:sz w:val="24"/>
+          <w:szCs w:val="24"/>
+        </w:rPr>
+        <w:t>frontend</w:t>
+      </w:r>
+      <w:r>
+        <w:rPr>
+          <w:rFonts w:ascii="Times New Roman" w:hAnsi="Times New Roman" w:eastAsia="Times New Roman" w:cs="Times New Roman"/>
+          <w:sz w:val="24"/>
+          <w:szCs w:val="24"/>
+        </w:rPr>
+        <w:t xml:space="preserve">; este dispara uma requisição JSON para a API RESTful; </w:t>
+      </w:r>
+      <w:r>
+        <w:rPr>
+          <w:rFonts w:ascii="Times New Roman" w:hAnsi="Times New Roman" w:eastAsia="Times New Roman" w:cs="Times New Roman"/>
+          <w:sz w:val="24"/>
+          <w:szCs w:val="24"/>
+        </w:rPr>
+        <w:t xml:space="preserve">o </w:t>
+      </w:r>
+      <w:r>
+        <w:rPr>
+          <w:rFonts w:ascii="Times New Roman" w:hAnsi="Times New Roman" w:eastAsia="Times New Roman" w:cs="Times New Roman"/>
+          <w:i w:val="1"/>
+          <w:iCs w:val="1"/>
+          <w:sz w:val="24"/>
+          <w:szCs w:val="24"/>
+        </w:rPr>
+        <w:t xml:space="preserve">backend </w:t>
+      </w:r>
+      <w:r>
+        <w:rPr>
+          <w:rFonts w:ascii="Times New Roman" w:hAnsi="Times New Roman" w:eastAsia="Times New Roman" w:cs="Times New Roman"/>
+          <w:sz w:val="24"/>
+          <w:szCs w:val="24"/>
+        </w:rPr>
+        <w:t xml:space="preserve">recebe a requisição, processa a lógica de negócio através da camada de </w:t>
+      </w:r>
+      <w:r>
+        <w:rPr>
+          <w:rFonts w:ascii="Times New Roman" w:hAnsi="Times New Roman" w:eastAsia="Times New Roman" w:cs="Times New Roman"/>
+          <w:i w:val="1"/>
+          <w:iCs w:val="1"/>
+          <w:sz w:val="24"/>
+          <w:szCs w:val="24"/>
+        </w:rPr>
+        <w:t xml:space="preserve">Services </w:t>
+      </w:r>
+      <w:r>
+        <w:rPr>
+          <w:rFonts w:ascii="Times New Roman" w:hAnsi="Times New Roman" w:eastAsia="Times New Roman" w:cs="Times New Roman"/>
+          <w:sz w:val="24"/>
+          <w:szCs w:val="24"/>
+        </w:rPr>
+        <w:t xml:space="preserve">e persiste os dados por meio de </w:t>
+      </w:r>
+      <w:r>
+        <w:rPr>
+          <w:rFonts w:ascii="Times New Roman" w:hAnsi="Times New Roman" w:eastAsia="Times New Roman" w:cs="Times New Roman"/>
+          <w:i w:val="1"/>
+          <w:iCs w:val="1"/>
+          <w:sz w:val="24"/>
+          <w:szCs w:val="24"/>
+        </w:rPr>
+        <w:t>Repositories</w:t>
       </w:r>
       <w:r>
         <w:rPr>
@@ -7032,8 +7773,8 @@
       <w:r>
         <w:rPr>
           <w:rFonts w:ascii="Times New Roman" w:hAnsi="Times New Roman" w:eastAsia="Times New Roman" w:cs="Times New Roman"/>
-          <w:i/>
-          <w:iCs/>
+          <w:i w:val="1"/>
+          <w:iCs w:val="1"/>
           <w:sz w:val="24"/>
           <w:szCs w:val="24"/>
         </w:rPr>
@@ -7042,10 +7783,20 @@
       <w:r>
         <w:rPr>
           <w:rFonts w:ascii="Times New Roman" w:hAnsi="Times New Roman" w:eastAsia="Times New Roman" w:cs="Times New Roman"/>
-          <w:sz w:val="24"/>
-          <w:szCs w:val="24"/>
-        </w:rPr>
-        <w:t xml:space="preserve"> atualizar a interface.</w:t>
+          <w:i w:val="1"/>
+          <w:iCs w:val="1"/>
+          <w:sz w:val="24"/>
+          <w:szCs w:val="24"/>
+        </w:rPr>
+        <w:t xml:space="preserve"> </w:t>
+      </w:r>
+      <w:r>
+        <w:rPr>
+          <w:rFonts w:ascii="Times New Roman" w:hAnsi="Times New Roman" w:eastAsia="Times New Roman" w:cs="Times New Roman"/>
+          <w:sz w:val="24"/>
+          <w:szCs w:val="24"/>
+        </w:rPr>
+        <w:t>atualizar a interface.</w:t>
       </w:r>
     </w:p>
     <w:p>
@@ -7087,7 +7838,7 @@
       </w:pPr>
       <w:r>
         <w:drawing>
-          <wp:inline wp14:editId="19A96043" wp14:anchorId="5DBBCDA0">
+          <wp:inline wp14:editId="345D1FAF" wp14:anchorId="5DBBCDA0">
             <wp:extent cx="6248400" cy="4326753"/>
             <wp:effectExtent l="0" t="0" r="0" b="0"/>
             <wp:docPr id="470353884" name="drawing"/>
@@ -7213,13 +7964,7 @@
       </w:pPr>
     </w:p>
     <w:p>
-      <w:r>
-        <w:br w:type="page"/>
-      </w:r>
-    </w:p>
-    <w:p>
-      <w:pPr>
-        <w:pStyle w:val="Normal"/>
+      <w:pPr>
         <w:jc w:val="center"/>
         <w:rPr>
           <w:i w:val="1"/>
@@ -7231,6 +7976,122 @@
     <w:p>
       <w:pPr>
         <w:jc w:val="center"/>
+        <w:rPr>
+          <w:i w:val="1"/>
+          <w:iCs w:val="1"/>
+          <w:color w:val="0432FF"/>
+        </w:rPr>
+      </w:pPr>
+    </w:p>
+    <w:p>
+      <w:pPr>
+        <w:jc w:val="center"/>
+        <w:rPr>
+          <w:i w:val="1"/>
+          <w:iCs w:val="1"/>
+          <w:color w:val="0432FF"/>
+        </w:rPr>
+      </w:pPr>
+    </w:p>
+    <w:p>
+      <w:pPr>
+        <w:jc w:val="center"/>
+        <w:rPr>
+          <w:i w:val="1"/>
+          <w:iCs w:val="1"/>
+          <w:color w:val="0432FF"/>
+        </w:rPr>
+      </w:pPr>
+    </w:p>
+    <w:p>
+      <w:pPr>
+        <w:jc w:val="center"/>
+        <w:rPr>
+          <w:i w:val="1"/>
+          <w:iCs w:val="1"/>
+          <w:color w:val="0432FF"/>
+        </w:rPr>
+      </w:pPr>
+    </w:p>
+    <w:p>
+      <w:pPr>
+        <w:jc w:val="center"/>
+        <w:rPr>
+          <w:i w:val="1"/>
+          <w:iCs w:val="1"/>
+          <w:color w:val="0432FF"/>
+        </w:rPr>
+      </w:pPr>
+    </w:p>
+    <w:p>
+      <w:pPr>
+        <w:jc w:val="center"/>
+        <w:rPr>
+          <w:i w:val="1"/>
+          <w:iCs w:val="1"/>
+          <w:color w:val="0432FF"/>
+        </w:rPr>
+      </w:pPr>
+    </w:p>
+    <w:p>
+      <w:pPr>
+        <w:jc w:val="center"/>
+        <w:rPr>
+          <w:i w:val="1"/>
+          <w:iCs w:val="1"/>
+          <w:color w:val="0432FF"/>
+        </w:rPr>
+      </w:pPr>
+    </w:p>
+    <w:p>
+      <w:pPr>
+        <w:jc w:val="center"/>
+        <w:rPr>
+          <w:i w:val="1"/>
+          <w:iCs w:val="1"/>
+          <w:color w:val="0432FF"/>
+        </w:rPr>
+      </w:pPr>
+    </w:p>
+    <w:p>
+      <w:pPr>
+        <w:jc w:val="center"/>
+        <w:rPr>
+          <w:i w:val="1"/>
+          <w:iCs w:val="1"/>
+          <w:color w:val="0432FF"/>
+        </w:rPr>
+      </w:pPr>
+    </w:p>
+    <w:p>
+      <w:pPr>
+        <w:jc w:val="center"/>
+        <w:rPr>
+          <w:i w:val="1"/>
+          <w:iCs w:val="1"/>
+          <w:color w:val="0432FF"/>
+        </w:rPr>
+      </w:pPr>
+    </w:p>
+    <w:p>
+      <w:r>
+        <w:br w:type="page"/>
+      </w:r>
+    </w:p>
+    <w:p>
+      <w:pPr>
+        <w:pStyle w:val="Normal"/>
+        <w:jc w:val="center"/>
+        <w:rPr>
+          <w:i w:val="1"/>
+          <w:iCs w:val="1"/>
+          <w:color w:val="0432FF"/>
+        </w:rPr>
+      </w:pPr>
+    </w:p>
+    <w:p>
+      <w:pPr>
+        <w:jc w:val="center"/>
       </w:pPr>
       <w:r>
         <w:rPr/>
@@ -7266,7 +8127,7 @@
       </w:pPr>
       <w:r>
         <w:drawing>
-          <wp:inline wp14:editId="3C0F3BA9" wp14:anchorId="04DE2A6F">
+          <wp:inline wp14:editId="1E4C4CBE" wp14:anchorId="04DE2A6F">
             <wp:extent cx="5724525" cy="4219876"/>
             <wp:effectExtent l="0" t="0" r="0" b="0"/>
             <wp:docPr id="493864765" name="drawing"/>
@@ -7674,7 +8535,7 @@
       </w:pPr>
       <w:r>
         <w:drawing>
-          <wp:inline wp14:editId="31299065" wp14:anchorId="6AA2459A">
+          <wp:inline wp14:editId="40EEA1FD" wp14:anchorId="6AA2459A">
             <wp:extent cx="5307591" cy="2622363"/>
             <wp:effectExtent l="0" t="0" r="0" b="0"/>
             <wp:docPr id="881943454" name="drawing"/>
@@ -9380,6 +10241,790 @@
 
 <file path=word/numbering.xml><?xml version="1.0" encoding="utf-8"?>
 <w:numbering xmlns:wpc="http://schemas.microsoft.com/office/word/2010/wordprocessingCanvas" xmlns:cx="http://schemas.microsoft.com/office/drawing/2014/chartex" xmlns:cx1="http://schemas.microsoft.com/office/drawing/2015/9/8/chartex" xmlns:cx2="http://schemas.microsoft.com/office/drawing/2015/10/21/chartex" xmlns:cx3="http://schemas.microsoft.com/office/drawing/2016/5/9/chartex" xmlns:cx4="http://schemas.microsoft.com/office/drawing/2016/5/10/chartex" xmlns:cx5="http://schemas.microsoft.com/office/drawing/2016/5/11/chartex" xmlns:cx6="http://schemas.microsoft.com/office/drawing/2016/5/12/chartex" xmlns:cx7="http://schemas.microsoft.com/office/drawing/2016/5/13/chartex" xmlns:cx8="http://schemas.microsoft.com/office/drawing/2016/5/14/chartex" xmlns:mc="http://schemas.openxmlformats.org/markup-compatibility/2006" xmlns:aink="http://schemas.microsoft.com/office/drawing/2016/ink" xmlns:am3d="http://schemas.microsoft.com/office/drawing/2017/model3d" xmlns:o="urn:schemas-microsoft-com:office:office" xmlns:oel="http://schemas.microsoft.com/office/2019/extlst" xmlns:r="http://schemas.openxmlformats.org/officeDocument/2006/relationships" xmlns:m="http://schemas.openxmlformats.org/officeDocument/2006/math" xmlns:v="urn:schemas-microsoft-com:vml" xmlns:wp14="http://schemas.microsoft.com/office/word/2010/wordprocessingDrawing" xmlns:wp="http://schemas.openxmlformats.org/drawingml/2006/wordprocessingDrawing" xmlns:w10="urn:schemas-microsoft-com:office:word" xmlns:w="http://schemas.openxmlformats.org/wordprocessingml/2006/main" xmlns:w14="http://schemas.microsoft.com/office/word/2010/wordml" xmlns:w15="http://schemas.microsoft.com/office/word/2012/wordml" xmlns:w16cex="http://schemas.microsoft.com/office/word/2018/wordml/cex" xmlns:w16cid="http://schemas.microsoft.com/office/word/2016/wordml/cid" xmlns:w16="http://schemas.microsoft.com/office/word/2018/wordml" xmlns:w16du="http://schemas.microsoft.com/office/word/2023/wordml/word16du" xmlns:w16sdtdh="http://schemas.microsoft.com/office/word/2020/wordml/sdtdatahash" xmlns:w16sdtfl="http://schemas.microsoft.com/office/word/2024/wordml/sdtformatlock" xmlns:w16se="http://schemas.microsoft.com/office/word/2015/wordml/symex" xmlns:wpg="http://schemas.microsoft.com/office/word/2010/wordprocessingGroup" xmlns:wpi="http://schemas.microsoft.com/office/word/2010/wordprocessingInk" xmlns:wne="http://schemas.microsoft.com/office/word/2006/wordml" xmlns:wps="http://schemas.microsoft.com/office/word/2010/wordprocessingShape" mc:Ignorable="w14 w15 w16se w16cid w16 w16cex w16sdtdh w16sdtfl w16du wp14">
+  <w:abstractNum xmlns:w="http://schemas.openxmlformats.org/wordprocessingml/2006/main" w:abstractNumId="24">
+    <w:nsid w:val="7accc756"/>
+    <w:multiLevelType xmlns:w="http://schemas.openxmlformats.org/wordprocessingml/2006/main" w:val="hybridMultilevel"/>
+    <w:lvl xmlns:w="http://schemas.openxmlformats.org/wordprocessingml/2006/main" w:ilvl="0">
+      <w:start w:val="1"/>
+      <w:numFmt w:val="bullet"/>
+      <w:lvlText w:val="-"/>
+      <w:lvlJc w:val="left"/>
+      <w:pPr>
+        <w:ind w:left="720" w:hanging="360"/>
+      </w:pPr>
+      <w:rPr>
+        <w:rFonts w:hint="default" w:ascii="Aptos" w:hAnsi="Aptos"/>
+      </w:rPr>
+    </w:lvl>
+    <w:lvl xmlns:w="http://schemas.openxmlformats.org/wordprocessingml/2006/main" w:ilvl="1">
+      <w:start w:val="1"/>
+      <w:numFmt w:val="bullet"/>
+      <w:lvlText w:val="o"/>
+      <w:lvlJc w:val="left"/>
+      <w:pPr>
+        <w:ind w:left="1440" w:hanging="360"/>
+      </w:pPr>
+      <w:rPr>
+        <w:rFonts w:hint="default" w:ascii="Courier New" w:hAnsi="Courier New"/>
+      </w:rPr>
+    </w:lvl>
+    <w:lvl xmlns:w="http://schemas.openxmlformats.org/wordprocessingml/2006/main" w:ilvl="2">
+      <w:start w:val="1"/>
+      <w:numFmt w:val="bullet"/>
+      <w:lvlText w:val=""/>
+      <w:lvlJc w:val="left"/>
+      <w:pPr>
+        <w:ind w:left="2160" w:hanging="360"/>
+      </w:pPr>
+      <w:rPr>
+        <w:rFonts w:hint="default" w:ascii="Wingdings" w:hAnsi="Wingdings"/>
+      </w:rPr>
+    </w:lvl>
+    <w:lvl xmlns:w="http://schemas.openxmlformats.org/wordprocessingml/2006/main" w:ilvl="3">
+      <w:start w:val="1"/>
+      <w:numFmt w:val="bullet"/>
+      <w:lvlText w:val=""/>
+      <w:lvlJc w:val="left"/>
+      <w:pPr>
+        <w:ind w:left="2880" w:hanging="360"/>
+      </w:pPr>
+      <w:rPr>
+        <w:rFonts w:hint="default" w:ascii="Symbol" w:hAnsi="Symbol"/>
+      </w:rPr>
+    </w:lvl>
+    <w:lvl xmlns:w="http://schemas.openxmlformats.org/wordprocessingml/2006/main" w:ilvl="4">
+      <w:start w:val="1"/>
+      <w:numFmt w:val="bullet"/>
+      <w:lvlText w:val="o"/>
+      <w:lvlJc w:val="left"/>
+      <w:pPr>
+        <w:ind w:left="3600" w:hanging="360"/>
+      </w:pPr>
+      <w:rPr>
+        <w:rFonts w:hint="default" w:ascii="Courier New" w:hAnsi="Courier New"/>
+      </w:rPr>
+    </w:lvl>
+    <w:lvl xmlns:w="http://schemas.openxmlformats.org/wordprocessingml/2006/main" w:ilvl="5">
+      <w:start w:val="1"/>
+      <w:numFmt w:val="bullet"/>
+      <w:lvlText w:val=""/>
+      <w:lvlJc w:val="left"/>
+      <w:pPr>
+        <w:ind w:left="4320" w:hanging="360"/>
+      </w:pPr>
+      <w:rPr>
+        <w:rFonts w:hint="default" w:ascii="Wingdings" w:hAnsi="Wingdings"/>
+      </w:rPr>
+    </w:lvl>
+    <w:lvl xmlns:w="http://schemas.openxmlformats.org/wordprocessingml/2006/main" w:ilvl="6">
+      <w:start w:val="1"/>
+      <w:numFmt w:val="bullet"/>
+      <w:lvlText w:val=""/>
+      <w:lvlJc w:val="left"/>
+      <w:pPr>
+        <w:ind w:left="5040" w:hanging="360"/>
+      </w:pPr>
+      <w:rPr>
+        <w:rFonts w:hint="default" w:ascii="Symbol" w:hAnsi="Symbol"/>
+      </w:rPr>
+    </w:lvl>
+    <w:lvl xmlns:w="http://schemas.openxmlformats.org/wordprocessingml/2006/main" w:ilvl="7">
+      <w:start w:val="1"/>
+      <w:numFmt w:val="bullet"/>
+      <w:lvlText w:val="o"/>
+      <w:lvlJc w:val="left"/>
+      <w:pPr>
+        <w:ind w:left="5760" w:hanging="360"/>
+      </w:pPr>
+      <w:rPr>
+        <w:rFonts w:hint="default" w:ascii="Courier New" w:hAnsi="Courier New"/>
+      </w:rPr>
+    </w:lvl>
+    <w:lvl xmlns:w="http://schemas.openxmlformats.org/wordprocessingml/2006/main" w:ilvl="8">
+      <w:start w:val="1"/>
+      <w:numFmt w:val="bullet"/>
+      <w:lvlText w:val=""/>
+      <w:lvlJc w:val="left"/>
+      <w:pPr>
+        <w:ind w:left="6480" w:hanging="360"/>
+      </w:pPr>
+      <w:rPr>
+        <w:rFonts w:hint="default" w:ascii="Wingdings" w:hAnsi="Wingdings"/>
+      </w:rPr>
+    </w:lvl>
+  </w:abstractNum>
+  <w:abstractNum xmlns:w="http://schemas.openxmlformats.org/wordprocessingml/2006/main" w:abstractNumId="23">
+    <w:nsid w:val="2f5f6cfd"/>
+    <w:multiLevelType xmlns:w="http://schemas.openxmlformats.org/wordprocessingml/2006/main" w:val="hybridMultilevel"/>
+    <w:lvl xmlns:w="http://schemas.openxmlformats.org/wordprocessingml/2006/main" w:ilvl="0">
+      <w:start w:val="1"/>
+      <w:numFmt w:val="bullet"/>
+      <w:lvlText w:val="-"/>
+      <w:lvlJc w:val="left"/>
+      <w:pPr>
+        <w:ind w:left="720" w:hanging="360"/>
+      </w:pPr>
+      <w:rPr>
+        <w:rFonts w:hint="default" w:ascii="Aptos" w:hAnsi="Aptos"/>
+      </w:rPr>
+    </w:lvl>
+    <w:lvl xmlns:w="http://schemas.openxmlformats.org/wordprocessingml/2006/main" w:ilvl="1">
+      <w:start w:val="1"/>
+      <w:numFmt w:val="bullet"/>
+      <w:lvlText w:val="o"/>
+      <w:lvlJc w:val="left"/>
+      <w:pPr>
+        <w:ind w:left="1440" w:hanging="360"/>
+      </w:pPr>
+      <w:rPr>
+        <w:rFonts w:hint="default" w:ascii="Courier New" w:hAnsi="Courier New"/>
+      </w:rPr>
+    </w:lvl>
+    <w:lvl xmlns:w="http://schemas.openxmlformats.org/wordprocessingml/2006/main" w:ilvl="2">
+      <w:start w:val="1"/>
+      <w:numFmt w:val="bullet"/>
+      <w:lvlText w:val=""/>
+      <w:lvlJc w:val="left"/>
+      <w:pPr>
+        <w:ind w:left="2160" w:hanging="360"/>
+      </w:pPr>
+      <w:rPr>
+        <w:rFonts w:hint="default" w:ascii="Wingdings" w:hAnsi="Wingdings"/>
+      </w:rPr>
+    </w:lvl>
+    <w:lvl xmlns:w="http://schemas.openxmlformats.org/wordprocessingml/2006/main" w:ilvl="3">
+      <w:start w:val="1"/>
+      <w:numFmt w:val="bullet"/>
+      <w:lvlText w:val=""/>
+      <w:lvlJc w:val="left"/>
+      <w:pPr>
+        <w:ind w:left="2880" w:hanging="360"/>
+      </w:pPr>
+      <w:rPr>
+        <w:rFonts w:hint="default" w:ascii="Symbol" w:hAnsi="Symbol"/>
+      </w:rPr>
+    </w:lvl>
+    <w:lvl xmlns:w="http://schemas.openxmlformats.org/wordprocessingml/2006/main" w:ilvl="4">
+      <w:start w:val="1"/>
+      <w:numFmt w:val="bullet"/>
+      <w:lvlText w:val="o"/>
+      <w:lvlJc w:val="left"/>
+      <w:pPr>
+        <w:ind w:left="3600" w:hanging="360"/>
+      </w:pPr>
+      <w:rPr>
+        <w:rFonts w:hint="default" w:ascii="Courier New" w:hAnsi="Courier New"/>
+      </w:rPr>
+    </w:lvl>
+    <w:lvl xmlns:w="http://schemas.openxmlformats.org/wordprocessingml/2006/main" w:ilvl="5">
+      <w:start w:val="1"/>
+      <w:numFmt w:val="bullet"/>
+      <w:lvlText w:val=""/>
+      <w:lvlJc w:val="left"/>
+      <w:pPr>
+        <w:ind w:left="4320" w:hanging="360"/>
+      </w:pPr>
+      <w:rPr>
+        <w:rFonts w:hint="default" w:ascii="Wingdings" w:hAnsi="Wingdings"/>
+      </w:rPr>
+    </w:lvl>
+    <w:lvl xmlns:w="http://schemas.openxmlformats.org/wordprocessingml/2006/main" w:ilvl="6">
+      <w:start w:val="1"/>
+      <w:numFmt w:val="bullet"/>
+      <w:lvlText w:val=""/>
+      <w:lvlJc w:val="left"/>
+      <w:pPr>
+        <w:ind w:left="5040" w:hanging="360"/>
+      </w:pPr>
+      <w:rPr>
+        <w:rFonts w:hint="default" w:ascii="Symbol" w:hAnsi="Symbol"/>
+      </w:rPr>
+    </w:lvl>
+    <w:lvl xmlns:w="http://schemas.openxmlformats.org/wordprocessingml/2006/main" w:ilvl="7">
+      <w:start w:val="1"/>
+      <w:numFmt w:val="bullet"/>
+      <w:lvlText w:val="o"/>
+      <w:lvlJc w:val="left"/>
+      <w:pPr>
+        <w:ind w:left="5760" w:hanging="360"/>
+      </w:pPr>
+      <w:rPr>
+        <w:rFonts w:hint="default" w:ascii="Courier New" w:hAnsi="Courier New"/>
+      </w:rPr>
+    </w:lvl>
+    <w:lvl xmlns:w="http://schemas.openxmlformats.org/wordprocessingml/2006/main" w:ilvl="8">
+      <w:start w:val="1"/>
+      <w:numFmt w:val="bullet"/>
+      <w:lvlText w:val=""/>
+      <w:lvlJc w:val="left"/>
+      <w:pPr>
+        <w:ind w:left="6480" w:hanging="360"/>
+      </w:pPr>
+      <w:rPr>
+        <w:rFonts w:hint="default" w:ascii="Wingdings" w:hAnsi="Wingdings"/>
+      </w:rPr>
+    </w:lvl>
+  </w:abstractNum>
+  <w:abstractNum xmlns:w="http://schemas.openxmlformats.org/wordprocessingml/2006/main" w:abstractNumId="22">
+    <w:nsid w:val="646db22e"/>
+    <w:multiLevelType xmlns:w="http://schemas.openxmlformats.org/wordprocessingml/2006/main" w:val="hybridMultilevel"/>
+    <w:lvl xmlns:w="http://schemas.openxmlformats.org/wordprocessingml/2006/main" w:ilvl="0">
+      <w:start w:val="1"/>
+      <w:numFmt w:val="bullet"/>
+      <w:lvlText w:val="-"/>
+      <w:lvlJc w:val="left"/>
+      <w:pPr>
+        <w:ind w:left="720" w:hanging="360"/>
+      </w:pPr>
+      <w:rPr>
+        <w:rFonts w:hint="default" w:ascii="Aptos" w:hAnsi="Aptos"/>
+      </w:rPr>
+    </w:lvl>
+    <w:lvl xmlns:w="http://schemas.openxmlformats.org/wordprocessingml/2006/main" w:ilvl="1">
+      <w:start w:val="1"/>
+      <w:numFmt w:val="bullet"/>
+      <w:lvlText w:val="o"/>
+      <w:lvlJc w:val="left"/>
+      <w:pPr>
+        <w:ind w:left="1440" w:hanging="360"/>
+      </w:pPr>
+      <w:rPr>
+        <w:rFonts w:hint="default" w:ascii="Courier New" w:hAnsi="Courier New"/>
+      </w:rPr>
+    </w:lvl>
+    <w:lvl xmlns:w="http://schemas.openxmlformats.org/wordprocessingml/2006/main" w:ilvl="2">
+      <w:start w:val="1"/>
+      <w:numFmt w:val="bullet"/>
+      <w:lvlText w:val=""/>
+      <w:lvlJc w:val="left"/>
+      <w:pPr>
+        <w:ind w:left="2160" w:hanging="360"/>
+      </w:pPr>
+      <w:rPr>
+        <w:rFonts w:hint="default" w:ascii="Wingdings" w:hAnsi="Wingdings"/>
+      </w:rPr>
+    </w:lvl>
+    <w:lvl xmlns:w="http://schemas.openxmlformats.org/wordprocessingml/2006/main" w:ilvl="3">
+      <w:start w:val="1"/>
+      <w:numFmt w:val="bullet"/>
+      <w:lvlText w:val=""/>
+      <w:lvlJc w:val="left"/>
+      <w:pPr>
+        <w:ind w:left="2880" w:hanging="360"/>
+      </w:pPr>
+      <w:rPr>
+        <w:rFonts w:hint="default" w:ascii="Symbol" w:hAnsi="Symbol"/>
+      </w:rPr>
+    </w:lvl>
+    <w:lvl xmlns:w="http://schemas.openxmlformats.org/wordprocessingml/2006/main" w:ilvl="4">
+      <w:start w:val="1"/>
+      <w:numFmt w:val="bullet"/>
+      <w:lvlText w:val="o"/>
+      <w:lvlJc w:val="left"/>
+      <w:pPr>
+        <w:ind w:left="3600" w:hanging="360"/>
+      </w:pPr>
+      <w:rPr>
+        <w:rFonts w:hint="default" w:ascii="Courier New" w:hAnsi="Courier New"/>
+      </w:rPr>
+    </w:lvl>
+    <w:lvl xmlns:w="http://schemas.openxmlformats.org/wordprocessingml/2006/main" w:ilvl="5">
+      <w:start w:val="1"/>
+      <w:numFmt w:val="bullet"/>
+      <w:lvlText w:val=""/>
+      <w:lvlJc w:val="left"/>
+      <w:pPr>
+        <w:ind w:left="4320" w:hanging="360"/>
+      </w:pPr>
+      <w:rPr>
+        <w:rFonts w:hint="default" w:ascii="Wingdings" w:hAnsi="Wingdings"/>
+      </w:rPr>
+    </w:lvl>
+    <w:lvl xmlns:w="http://schemas.openxmlformats.org/wordprocessingml/2006/main" w:ilvl="6">
+      <w:start w:val="1"/>
+      <w:numFmt w:val="bullet"/>
+      <w:lvlText w:val=""/>
+      <w:lvlJc w:val="left"/>
+      <w:pPr>
+        <w:ind w:left="5040" w:hanging="360"/>
+      </w:pPr>
+      <w:rPr>
+        <w:rFonts w:hint="default" w:ascii="Symbol" w:hAnsi="Symbol"/>
+      </w:rPr>
+    </w:lvl>
+    <w:lvl xmlns:w="http://schemas.openxmlformats.org/wordprocessingml/2006/main" w:ilvl="7">
+      <w:start w:val="1"/>
+      <w:numFmt w:val="bullet"/>
+      <w:lvlText w:val="o"/>
+      <w:lvlJc w:val="left"/>
+      <w:pPr>
+        <w:ind w:left="5760" w:hanging="360"/>
+      </w:pPr>
+      <w:rPr>
+        <w:rFonts w:hint="default" w:ascii="Courier New" w:hAnsi="Courier New"/>
+      </w:rPr>
+    </w:lvl>
+    <w:lvl xmlns:w="http://schemas.openxmlformats.org/wordprocessingml/2006/main" w:ilvl="8">
+      <w:start w:val="1"/>
+      <w:numFmt w:val="bullet"/>
+      <w:lvlText w:val=""/>
+      <w:lvlJc w:val="left"/>
+      <w:pPr>
+        <w:ind w:left="6480" w:hanging="360"/>
+      </w:pPr>
+      <w:rPr>
+        <w:rFonts w:hint="default" w:ascii="Wingdings" w:hAnsi="Wingdings"/>
+      </w:rPr>
+    </w:lvl>
+  </w:abstractNum>
+  <w:abstractNum xmlns:w="http://schemas.openxmlformats.org/wordprocessingml/2006/main" w:abstractNumId="21">
+    <w:nsid w:val="48d28594"/>
+    <w:multiLevelType xmlns:w="http://schemas.openxmlformats.org/wordprocessingml/2006/main" w:val="hybridMultilevel"/>
+    <w:lvl xmlns:w="http://schemas.openxmlformats.org/wordprocessingml/2006/main" w:ilvl="0">
+      <w:start w:val="1"/>
+      <w:numFmt w:val="bullet"/>
+      <w:lvlText w:val="-"/>
+      <w:lvlJc w:val="left"/>
+      <w:pPr>
+        <w:ind w:left="720" w:hanging="360"/>
+      </w:pPr>
+      <w:rPr>
+        <w:rFonts w:hint="default" w:ascii="Aptos" w:hAnsi="Aptos"/>
+      </w:rPr>
+    </w:lvl>
+    <w:lvl xmlns:w="http://schemas.openxmlformats.org/wordprocessingml/2006/main" w:ilvl="1">
+      <w:start w:val="1"/>
+      <w:numFmt w:val="bullet"/>
+      <w:lvlText w:val="o"/>
+      <w:lvlJc w:val="left"/>
+      <w:pPr>
+        <w:ind w:left="1440" w:hanging="360"/>
+      </w:pPr>
+      <w:rPr>
+        <w:rFonts w:hint="default" w:ascii="Courier New" w:hAnsi="Courier New"/>
+      </w:rPr>
+    </w:lvl>
+    <w:lvl xmlns:w="http://schemas.openxmlformats.org/wordprocessingml/2006/main" w:ilvl="2">
+      <w:start w:val="1"/>
+      <w:numFmt w:val="bullet"/>
+      <w:lvlText w:val=""/>
+      <w:lvlJc w:val="left"/>
+      <w:pPr>
+        <w:ind w:left="2160" w:hanging="360"/>
+      </w:pPr>
+      <w:rPr>
+        <w:rFonts w:hint="default" w:ascii="Wingdings" w:hAnsi="Wingdings"/>
+      </w:rPr>
+    </w:lvl>
+    <w:lvl xmlns:w="http://schemas.openxmlformats.org/wordprocessingml/2006/main" w:ilvl="3">
+      <w:start w:val="1"/>
+      <w:numFmt w:val="bullet"/>
+      <w:lvlText w:val=""/>
+      <w:lvlJc w:val="left"/>
+      <w:pPr>
+        <w:ind w:left="2880" w:hanging="360"/>
+      </w:pPr>
+      <w:rPr>
+        <w:rFonts w:hint="default" w:ascii="Symbol" w:hAnsi="Symbol"/>
+      </w:rPr>
+    </w:lvl>
+    <w:lvl xmlns:w="http://schemas.openxmlformats.org/wordprocessingml/2006/main" w:ilvl="4">
+      <w:start w:val="1"/>
+      <w:numFmt w:val="bullet"/>
+      <w:lvlText w:val="o"/>
+      <w:lvlJc w:val="left"/>
+      <w:pPr>
+        <w:ind w:left="3600" w:hanging="360"/>
+      </w:pPr>
+      <w:rPr>
+        <w:rFonts w:hint="default" w:ascii="Courier New" w:hAnsi="Courier New"/>
+      </w:rPr>
+    </w:lvl>
+    <w:lvl xmlns:w="http://schemas.openxmlformats.org/wordprocessingml/2006/main" w:ilvl="5">
+      <w:start w:val="1"/>
+      <w:numFmt w:val="bullet"/>
+      <w:lvlText w:val=""/>
+      <w:lvlJc w:val="left"/>
+      <w:pPr>
+        <w:ind w:left="4320" w:hanging="360"/>
+      </w:pPr>
+      <w:rPr>
+        <w:rFonts w:hint="default" w:ascii="Wingdings" w:hAnsi="Wingdings"/>
+      </w:rPr>
+    </w:lvl>
+    <w:lvl xmlns:w="http://schemas.openxmlformats.org/wordprocessingml/2006/main" w:ilvl="6">
+      <w:start w:val="1"/>
+      <w:numFmt w:val="bullet"/>
+      <w:lvlText w:val=""/>
+      <w:lvlJc w:val="left"/>
+      <w:pPr>
+        <w:ind w:left="5040" w:hanging="360"/>
+      </w:pPr>
+      <w:rPr>
+        <w:rFonts w:hint="default" w:ascii="Symbol" w:hAnsi="Symbol"/>
+      </w:rPr>
+    </w:lvl>
+    <w:lvl xmlns:w="http://schemas.openxmlformats.org/wordprocessingml/2006/main" w:ilvl="7">
+      <w:start w:val="1"/>
+      <w:numFmt w:val="bullet"/>
+      <w:lvlText w:val="o"/>
+      <w:lvlJc w:val="left"/>
+      <w:pPr>
+        <w:ind w:left="5760" w:hanging="360"/>
+      </w:pPr>
+      <w:rPr>
+        <w:rFonts w:hint="default" w:ascii="Courier New" w:hAnsi="Courier New"/>
+      </w:rPr>
+    </w:lvl>
+    <w:lvl xmlns:w="http://schemas.openxmlformats.org/wordprocessingml/2006/main" w:ilvl="8">
+      <w:start w:val="1"/>
+      <w:numFmt w:val="bullet"/>
+      <w:lvlText w:val=""/>
+      <w:lvlJc w:val="left"/>
+      <w:pPr>
+        <w:ind w:left="6480" w:hanging="360"/>
+      </w:pPr>
+      <w:rPr>
+        <w:rFonts w:hint="default" w:ascii="Wingdings" w:hAnsi="Wingdings"/>
+      </w:rPr>
+    </w:lvl>
+  </w:abstractNum>
+  <w:abstractNum xmlns:w="http://schemas.openxmlformats.org/wordprocessingml/2006/main" w:abstractNumId="20">
+    <w:nsid w:val="339101fc"/>
+    <w:multiLevelType xmlns:w="http://schemas.openxmlformats.org/wordprocessingml/2006/main" w:val="hybridMultilevel"/>
+    <w:lvl xmlns:w="http://schemas.openxmlformats.org/wordprocessingml/2006/main" w:ilvl="0">
+      <w:start w:val="1"/>
+      <w:numFmt w:val="bullet"/>
+      <w:lvlText w:val="-"/>
+      <w:lvlJc w:val="left"/>
+      <w:pPr>
+        <w:ind w:left="720" w:hanging="360"/>
+      </w:pPr>
+      <w:rPr>
+        <w:rFonts w:hint="default" w:ascii="Aptos" w:hAnsi="Aptos"/>
+      </w:rPr>
+    </w:lvl>
+    <w:lvl xmlns:w="http://schemas.openxmlformats.org/wordprocessingml/2006/main" w:ilvl="1">
+      <w:start w:val="1"/>
+      <w:numFmt w:val="bullet"/>
+      <w:lvlText w:val="o"/>
+      <w:lvlJc w:val="left"/>
+      <w:pPr>
+        <w:ind w:left="1440" w:hanging="360"/>
+      </w:pPr>
+      <w:rPr>
+        <w:rFonts w:hint="default" w:ascii="Courier New" w:hAnsi="Courier New"/>
+      </w:rPr>
+    </w:lvl>
+    <w:lvl xmlns:w="http://schemas.openxmlformats.org/wordprocessingml/2006/main" w:ilvl="2">
+      <w:start w:val="1"/>
+      <w:numFmt w:val="bullet"/>
+      <w:lvlText w:val=""/>
+      <w:lvlJc w:val="left"/>
+      <w:pPr>
+        <w:ind w:left="2160" w:hanging="360"/>
+      </w:pPr>
+      <w:rPr>
+        <w:rFonts w:hint="default" w:ascii="Wingdings" w:hAnsi="Wingdings"/>
+      </w:rPr>
+    </w:lvl>
+    <w:lvl xmlns:w="http://schemas.openxmlformats.org/wordprocessingml/2006/main" w:ilvl="3">
+      <w:start w:val="1"/>
+      <w:numFmt w:val="bullet"/>
+      <w:lvlText w:val=""/>
+      <w:lvlJc w:val="left"/>
+      <w:pPr>
+        <w:ind w:left="2880" w:hanging="360"/>
+      </w:pPr>
+      <w:rPr>
+        <w:rFonts w:hint="default" w:ascii="Symbol" w:hAnsi="Symbol"/>
+      </w:rPr>
+    </w:lvl>
+    <w:lvl xmlns:w="http://schemas.openxmlformats.org/wordprocessingml/2006/main" w:ilvl="4">
+      <w:start w:val="1"/>
+      <w:numFmt w:val="bullet"/>
+      <w:lvlText w:val="o"/>
+      <w:lvlJc w:val="left"/>
+      <w:pPr>
+        <w:ind w:left="3600" w:hanging="360"/>
+      </w:pPr>
+      <w:rPr>
+        <w:rFonts w:hint="default" w:ascii="Courier New" w:hAnsi="Courier New"/>
+      </w:rPr>
+    </w:lvl>
+    <w:lvl xmlns:w="http://schemas.openxmlformats.org/wordprocessingml/2006/main" w:ilvl="5">
+      <w:start w:val="1"/>
+      <w:numFmt w:val="bullet"/>
+      <w:lvlText w:val=""/>
+      <w:lvlJc w:val="left"/>
+      <w:pPr>
+        <w:ind w:left="4320" w:hanging="360"/>
+      </w:pPr>
+      <w:rPr>
+        <w:rFonts w:hint="default" w:ascii="Wingdings" w:hAnsi="Wingdings"/>
+      </w:rPr>
+    </w:lvl>
+    <w:lvl xmlns:w="http://schemas.openxmlformats.org/wordprocessingml/2006/main" w:ilvl="6">
+      <w:start w:val="1"/>
+      <w:numFmt w:val="bullet"/>
+      <w:lvlText w:val=""/>
+      <w:lvlJc w:val="left"/>
+      <w:pPr>
+        <w:ind w:left="5040" w:hanging="360"/>
+      </w:pPr>
+      <w:rPr>
+        <w:rFonts w:hint="default" w:ascii="Symbol" w:hAnsi="Symbol"/>
+      </w:rPr>
+    </w:lvl>
+    <w:lvl xmlns:w="http://schemas.openxmlformats.org/wordprocessingml/2006/main" w:ilvl="7">
+      <w:start w:val="1"/>
+      <w:numFmt w:val="bullet"/>
+      <w:lvlText w:val="o"/>
+      <w:lvlJc w:val="left"/>
+      <w:pPr>
+        <w:ind w:left="5760" w:hanging="360"/>
+      </w:pPr>
+      <w:rPr>
+        <w:rFonts w:hint="default" w:ascii="Courier New" w:hAnsi="Courier New"/>
+      </w:rPr>
+    </w:lvl>
+    <w:lvl xmlns:w="http://schemas.openxmlformats.org/wordprocessingml/2006/main" w:ilvl="8">
+      <w:start w:val="1"/>
+      <w:numFmt w:val="bullet"/>
+      <w:lvlText w:val=""/>
+      <w:lvlJc w:val="left"/>
+      <w:pPr>
+        <w:ind w:left="6480" w:hanging="360"/>
+      </w:pPr>
+      <w:rPr>
+        <w:rFonts w:hint="default" w:ascii="Wingdings" w:hAnsi="Wingdings"/>
+      </w:rPr>
+    </w:lvl>
+  </w:abstractNum>
+  <w:abstractNum xmlns:w="http://schemas.openxmlformats.org/wordprocessingml/2006/main" w:abstractNumId="19">
+    <w:nsid w:val="5d29ce89"/>
+    <w:multiLevelType xmlns:w="http://schemas.openxmlformats.org/wordprocessingml/2006/main" w:val="hybridMultilevel"/>
+    <w:lvl xmlns:w="http://schemas.openxmlformats.org/wordprocessingml/2006/main" w:ilvl="0">
+      <w:start w:val="1"/>
+      <w:numFmt w:val="bullet"/>
+      <w:lvlText w:val=""/>
+      <w:lvlJc w:val="left"/>
+      <w:pPr>
+        <w:ind w:left="1080" w:hanging="360"/>
+      </w:pPr>
+      <w:rPr>
+        <w:rFonts w:hint="default" w:ascii="Symbol" w:hAnsi="Symbol"/>
+      </w:rPr>
+    </w:lvl>
+    <w:lvl xmlns:w="http://schemas.openxmlformats.org/wordprocessingml/2006/main" w:ilvl="1">
+      <w:start w:val="1"/>
+      <w:numFmt w:val="bullet"/>
+      <w:lvlText w:val="o"/>
+      <w:lvlJc w:val="left"/>
+      <w:pPr>
+        <w:ind w:left="1800" w:hanging="360"/>
+      </w:pPr>
+      <w:rPr>
+        <w:rFonts w:hint="default" w:ascii="Courier New" w:hAnsi="Courier New"/>
+      </w:rPr>
+    </w:lvl>
+    <w:lvl xmlns:w="http://schemas.openxmlformats.org/wordprocessingml/2006/main" w:ilvl="2">
+      <w:start w:val="1"/>
+      <w:numFmt w:val="bullet"/>
+      <w:lvlText w:val=""/>
+      <w:lvlJc w:val="left"/>
+      <w:pPr>
+        <w:ind w:left="2520" w:hanging="360"/>
+      </w:pPr>
+      <w:rPr>
+        <w:rFonts w:hint="default" w:ascii="Wingdings" w:hAnsi="Wingdings"/>
+      </w:rPr>
+    </w:lvl>
+    <w:lvl xmlns:w="http://schemas.openxmlformats.org/wordprocessingml/2006/main" w:ilvl="3">
+      <w:start w:val="1"/>
+      <w:numFmt w:val="bullet"/>
+      <w:lvlText w:val=""/>
+      <w:lvlJc w:val="left"/>
+      <w:pPr>
+        <w:ind w:left="3240" w:hanging="360"/>
+      </w:pPr>
+      <w:rPr>
+        <w:rFonts w:hint="default" w:ascii="Symbol" w:hAnsi="Symbol"/>
+      </w:rPr>
+    </w:lvl>
+    <w:lvl xmlns:w="http://schemas.openxmlformats.org/wordprocessingml/2006/main" w:ilvl="4">
+      <w:start w:val="1"/>
+      <w:numFmt w:val="bullet"/>
+      <w:lvlText w:val="o"/>
+      <w:lvlJc w:val="left"/>
+      <w:pPr>
+        <w:ind w:left="3960" w:hanging="360"/>
+      </w:pPr>
+      <w:rPr>
+        <w:rFonts w:hint="default" w:ascii="Courier New" w:hAnsi="Courier New"/>
+      </w:rPr>
+    </w:lvl>
+    <w:lvl xmlns:w="http://schemas.openxmlformats.org/wordprocessingml/2006/main" w:ilvl="5">
+      <w:start w:val="1"/>
+      <w:numFmt w:val="bullet"/>
+      <w:lvlText w:val=""/>
+      <w:lvlJc w:val="left"/>
+      <w:pPr>
+        <w:ind w:left="4680" w:hanging="360"/>
+      </w:pPr>
+      <w:rPr>
+        <w:rFonts w:hint="default" w:ascii="Wingdings" w:hAnsi="Wingdings"/>
+      </w:rPr>
+    </w:lvl>
+    <w:lvl xmlns:w="http://schemas.openxmlformats.org/wordprocessingml/2006/main" w:ilvl="6">
+      <w:start w:val="1"/>
+      <w:numFmt w:val="bullet"/>
+      <w:lvlText w:val=""/>
+      <w:lvlJc w:val="left"/>
+      <w:pPr>
+        <w:ind w:left="5400" w:hanging="360"/>
+      </w:pPr>
+      <w:rPr>
+        <w:rFonts w:hint="default" w:ascii="Symbol" w:hAnsi="Symbol"/>
+      </w:rPr>
+    </w:lvl>
+    <w:lvl xmlns:w="http://schemas.openxmlformats.org/wordprocessingml/2006/main" w:ilvl="7">
+      <w:start w:val="1"/>
+      <w:numFmt w:val="bullet"/>
+      <w:lvlText w:val="o"/>
+      <w:lvlJc w:val="left"/>
+      <w:pPr>
+        <w:ind w:left="6120" w:hanging="360"/>
+      </w:pPr>
+      <w:rPr>
+        <w:rFonts w:hint="default" w:ascii="Courier New" w:hAnsi="Courier New"/>
+      </w:rPr>
+    </w:lvl>
+    <w:lvl xmlns:w="http://schemas.openxmlformats.org/wordprocessingml/2006/main" w:ilvl="8">
+      <w:start w:val="1"/>
+      <w:numFmt w:val="bullet"/>
+      <w:lvlText w:val=""/>
+      <w:lvlJc w:val="left"/>
+      <w:pPr>
+        <w:ind w:left="6840" w:hanging="360"/>
+      </w:pPr>
+      <w:rPr>
+        <w:rFonts w:hint="default" w:ascii="Wingdings" w:hAnsi="Wingdings"/>
+      </w:rPr>
+    </w:lvl>
+  </w:abstractNum>
+  <w:abstractNum xmlns:w="http://schemas.openxmlformats.org/wordprocessingml/2006/main" w:abstractNumId="18">
+    <w:nsid w:val="6e2625a9"/>
+    <w:multiLevelType xmlns:w="http://schemas.openxmlformats.org/wordprocessingml/2006/main" w:val="hybridMultilevel"/>
+    <w:lvl xmlns:w="http://schemas.openxmlformats.org/wordprocessingml/2006/main" w:ilvl="0">
+      <w:start w:val="1"/>
+      <w:numFmt w:val="bullet"/>
+      <w:lvlText w:val="-"/>
+      <w:lvlJc w:val="left"/>
+      <w:pPr>
+        <w:ind w:left="720" w:hanging="360"/>
+      </w:pPr>
+      <w:rPr>
+        <w:rFonts w:hint="default" w:ascii="Aptos" w:hAnsi="Aptos"/>
+      </w:rPr>
+    </w:lvl>
+    <w:lvl xmlns:w="http://schemas.openxmlformats.org/wordprocessingml/2006/main" w:ilvl="1">
+      <w:start w:val="1"/>
+      <w:numFmt w:val="bullet"/>
+      <w:lvlText w:val="o"/>
+      <w:lvlJc w:val="left"/>
+      <w:pPr>
+        <w:ind w:left="1440" w:hanging="360"/>
+      </w:pPr>
+      <w:rPr>
+        <w:rFonts w:hint="default" w:ascii="Courier New" w:hAnsi="Courier New"/>
+      </w:rPr>
+    </w:lvl>
+    <w:lvl xmlns:w="http://schemas.openxmlformats.org/wordprocessingml/2006/main" w:ilvl="2">
+      <w:start w:val="1"/>
+      <w:numFmt w:val="bullet"/>
+      <w:lvlText w:val=""/>
+      <w:lvlJc w:val="left"/>
+      <w:pPr>
+        <w:ind w:left="2160" w:hanging="360"/>
+      </w:pPr>
+      <w:rPr>
+        <w:rFonts w:hint="default" w:ascii="Wingdings" w:hAnsi="Wingdings"/>
+      </w:rPr>
+    </w:lvl>
+    <w:lvl xmlns:w="http://schemas.openxmlformats.org/wordprocessingml/2006/main" w:ilvl="3">
+      <w:start w:val="1"/>
+      <w:numFmt w:val="bullet"/>
+      <w:lvlText w:val=""/>
+      <w:lvlJc w:val="left"/>
+      <w:pPr>
+        <w:ind w:left="2880" w:hanging="360"/>
+      </w:pPr>
+      <w:rPr>
+        <w:rFonts w:hint="default" w:ascii="Symbol" w:hAnsi="Symbol"/>
+      </w:rPr>
+    </w:lvl>
+    <w:lvl xmlns:w="http://schemas.openxmlformats.org/wordprocessingml/2006/main" w:ilvl="4">
+      <w:start w:val="1"/>
+      <w:numFmt w:val="bullet"/>
+      <w:lvlText w:val="o"/>
+      <w:lvlJc w:val="left"/>
+      <w:pPr>
+        <w:ind w:left="3600" w:hanging="360"/>
+      </w:pPr>
+      <w:rPr>
+        <w:rFonts w:hint="default" w:ascii="Courier New" w:hAnsi="Courier New"/>
+      </w:rPr>
+    </w:lvl>
+    <w:lvl xmlns:w="http://schemas.openxmlformats.org/wordprocessingml/2006/main" w:ilvl="5">
+      <w:start w:val="1"/>
+      <w:numFmt w:val="bullet"/>
+      <w:lvlText w:val=""/>
+      <w:lvlJc w:val="left"/>
+      <w:pPr>
+        <w:ind w:left="4320" w:hanging="360"/>
+      </w:pPr>
+      <w:rPr>
+        <w:rFonts w:hint="default" w:ascii="Wingdings" w:hAnsi="Wingdings"/>
+      </w:rPr>
+    </w:lvl>
+    <w:lvl xmlns:w="http://schemas.openxmlformats.org/wordprocessingml/2006/main" w:ilvl="6">
+      <w:start w:val="1"/>
+      <w:numFmt w:val="bullet"/>
+      <w:lvlText w:val=""/>
+      <w:lvlJc w:val="left"/>
+      <w:pPr>
+        <w:ind w:left="5040" w:hanging="360"/>
+      </w:pPr>
+      <w:rPr>
+        <w:rFonts w:hint="default" w:ascii="Symbol" w:hAnsi="Symbol"/>
+      </w:rPr>
+    </w:lvl>
+    <w:lvl xmlns:w="http://schemas.openxmlformats.org/wordprocessingml/2006/main" w:ilvl="7">
+      <w:start w:val="1"/>
+      <w:numFmt w:val="bullet"/>
+      <w:lvlText w:val="o"/>
+      <w:lvlJc w:val="left"/>
+      <w:pPr>
+        <w:ind w:left="5760" w:hanging="360"/>
+      </w:pPr>
+      <w:rPr>
+        <w:rFonts w:hint="default" w:ascii="Courier New" w:hAnsi="Courier New"/>
+      </w:rPr>
+    </w:lvl>
+    <w:lvl xmlns:w="http://schemas.openxmlformats.org/wordprocessingml/2006/main" w:ilvl="8">
+      <w:start w:val="1"/>
+      <w:numFmt w:val="bullet"/>
+      <w:lvlText w:val=""/>
+      <w:lvlJc w:val="left"/>
+      <w:pPr>
+        <w:ind w:left="6480" w:hanging="360"/>
+      </w:pPr>
+      <w:rPr>
+        <w:rFonts w:hint="default" w:ascii="Wingdings" w:hAnsi="Wingdings"/>
+      </w:rPr>
+    </w:lvl>
+  </w:abstractNum>
   <w:abstractNum w:abstractNumId="0" w15:restartNumberingAfterBreak="0">
     <w:nsid w:val="00000001"/>
     <w:multiLevelType w:val="singleLevel"/>
@@ -11241,6 +12886,27 @@
       </w:rPr>
     </w:lvl>
   </w:abstractNum>
+  <w:num w:numId="20">
+    <w:abstractNumId w:val="24"/>
+  </w:num>
+  <w:num w:numId="19">
+    <w:abstractNumId w:val="23"/>
+  </w:num>
+  <w:num w:numId="18">
+    <w:abstractNumId w:val="22"/>
+  </w:num>
+  <w:num w:numId="17">
+    <w:abstractNumId w:val="21"/>
+  </w:num>
+  <w:num w:numId="16">
+    <w:abstractNumId w:val="20"/>
+  </w:num>
+  <w:num w:numId="15">
+    <w:abstractNumId w:val="19"/>
+  </w:num>
+  <w:num w:numId="14">
+    <w:abstractNumId w:val="18"/>
+  </w:num>
   <w:num w:numId="1" w16cid:durableId="837620746">
     <w:abstractNumId w:val="12"/>
   </w:num>

</xml_diff>